<commit_message>
frequency count promblem in dictonary
</commit_message>
<xml_diff>
--- a/L1.docx
+++ b/L1.docx
@@ -299,20 +299,36 @@
         <w:spacing w:after="60"/>
       </w:pPr>
       <w:r>
-        <w:t>for i in range(n):       # O(n)</w:t>
-      </w:r>
-    </w:p>
-    <w:p>
-      <w:pPr>
-        <w:spacing w:after="60"/>
-      </w:pPr>
-    </w:p>
-    <w:p>
-      <w:pPr>
-        <w:spacing w:after="60"/>
-      </w:pPr>
-      <w:r>
-        <w:t>for i in range(n):       # O(n)</w:t>
+        <w:t xml:space="preserve">for </w:t>
+      </w:r>
+      <w:proofErr w:type="spellStart"/>
+      <w:r>
+        <w:t>i</w:t>
+      </w:r>
+      <w:proofErr w:type="spellEnd"/>
+      <w:r>
+        <w:t xml:space="preserve"> in range(n):       # O(n)</w:t>
+      </w:r>
+    </w:p>
+    <w:p>
+      <w:pPr>
+        <w:spacing w:after="60"/>
+      </w:pPr>
+    </w:p>
+    <w:p>
+      <w:pPr>
+        <w:spacing w:after="60"/>
+      </w:pPr>
+      <w:r>
+        <w:t xml:space="preserve">for </w:t>
+      </w:r>
+      <w:proofErr w:type="spellStart"/>
+      <w:r>
+        <w:t>i</w:t>
+      </w:r>
+      <w:proofErr w:type="spellEnd"/>
+      <w:r>
+        <w:t xml:space="preserve"> in range(n):       # O(n)</w:t>
       </w:r>
     </w:p>
     <w:p>
@@ -352,7 +368,15 @@
         <w:spacing w:after="60"/>
       </w:pPr>
       <w:r>
-        <w:t>for i in range(n):</w:t>
+        <w:t xml:space="preserve">for </w:t>
+      </w:r>
+      <w:proofErr w:type="spellStart"/>
+      <w:r>
+        <w:t>i</w:t>
+      </w:r>
+      <w:proofErr w:type="spellEnd"/>
+      <w:r>
+        <w:t xml:space="preserve"> in range(n):</w:t>
       </w:r>
     </w:p>
     <w:p>
@@ -374,9 +398,14 @@
       <w:r>
         <w:t>print(</w:t>
       </w:r>
+      <w:proofErr w:type="spellStart"/>
       <w:proofErr w:type="gramEnd"/>
       <w:r>
-        <w:t>i, j)</w:t>
+        <w:t>i</w:t>
+      </w:r>
+      <w:proofErr w:type="spellEnd"/>
+      <w:r>
+        <w:t>, j)</w:t>
       </w:r>
     </w:p>
     <w:p>
@@ -639,9 +668,14 @@
             <w:r>
               <w:t xml:space="preserve">Access </w:t>
             </w:r>
+            <w:proofErr w:type="spellStart"/>
             <w:proofErr w:type="gramStart"/>
             <w:r>
-              <w:t>arr[</w:t>
+              <w:t>arr</w:t>
+            </w:r>
+            <w:proofErr w:type="spellEnd"/>
+            <w:r>
+              <w:t>[</w:t>
             </w:r>
             <w:proofErr w:type="gramEnd"/>
             <w:r>
@@ -789,9 +823,11 @@
             <w:pPr>
               <w:spacing w:after="60"/>
             </w:pPr>
+            <w:proofErr w:type="spellStart"/>
             <w:r>
               <w:t>Linearithmic</w:t>
             </w:r>
+            <w:proofErr w:type="spellEnd"/>
           </w:p>
         </w:tc>
         <w:tc>
@@ -1330,7 +1366,15 @@
         <w:spacing w:after="60"/>
       </w:pPr>
       <w:r>
-        <w:t>def double(arr):</w:t>
+        <w:t>def double(</w:t>
+      </w:r>
+      <w:proofErr w:type="spellStart"/>
+      <w:r>
+        <w:t>arr</w:t>
+      </w:r>
+      <w:proofErr w:type="spellEnd"/>
+      <w:r>
+        <w:t>):</w:t>
       </w:r>
     </w:p>
     <w:p>
@@ -1351,7 +1395,15 @@
         <w:spacing w:after="60"/>
       </w:pPr>
       <w:r>
-        <w:t xml:space="preserve">    for x in arr:</w:t>
+        <w:t xml:space="preserve">    for x in </w:t>
+      </w:r>
+      <w:proofErr w:type="spellStart"/>
+      <w:r>
+        <w:t>arr</w:t>
+      </w:r>
+      <w:proofErr w:type="spellEnd"/>
+      <w:r>
+        <w:t>:</w:t>
       </w:r>
     </w:p>
     <w:p>
@@ -1361,10 +1413,12 @@
       <w:r>
         <w:t xml:space="preserve">        </w:t>
       </w:r>
+      <w:proofErr w:type="spellStart"/>
       <w:proofErr w:type="gramStart"/>
       <w:r>
         <w:t>result.append</w:t>
       </w:r>
+      <w:proofErr w:type="spellEnd"/>
       <w:proofErr w:type="gramEnd"/>
       <w:r>
         <w:t>(x * 2)</w:t>
@@ -1492,15 +1546,31 @@
         <w:spacing w:after="60"/>
       </w:pPr>
       <w:r>
-        <w:t>for i in range(n):</w:t>
-      </w:r>
-    </w:p>
-    <w:p>
-      <w:pPr>
-        <w:spacing w:after="60"/>
-      </w:pPr>
-      <w:r>
-        <w:t xml:space="preserve">    print(i)</w:t>
+        <w:t xml:space="preserve">for </w:t>
+      </w:r>
+      <w:proofErr w:type="spellStart"/>
+      <w:r>
+        <w:t>i</w:t>
+      </w:r>
+      <w:proofErr w:type="spellEnd"/>
+      <w:r>
+        <w:t xml:space="preserve"> in range(n):</w:t>
+      </w:r>
+    </w:p>
+    <w:p>
+      <w:pPr>
+        <w:spacing w:after="60"/>
+      </w:pPr>
+      <w:r>
+        <w:t xml:space="preserve">    print(</w:t>
+      </w:r>
+      <w:proofErr w:type="spellStart"/>
+      <w:r>
+        <w:t>i</w:t>
+      </w:r>
+      <w:proofErr w:type="spellEnd"/>
+      <w:r>
+        <w:t>)</w:t>
       </w:r>
     </w:p>
     <w:p>
@@ -1559,7 +1629,15 @@
         <w:spacing w:after="60"/>
       </w:pPr>
       <w:r>
-        <w:t>for i in range(n):</w:t>
+        <w:t xml:space="preserve">for </w:t>
+      </w:r>
+      <w:proofErr w:type="spellStart"/>
+      <w:r>
+        <w:t>i</w:t>
+      </w:r>
+      <w:proofErr w:type="spellEnd"/>
+      <w:r>
+        <w:t xml:space="preserve"> in range(n):</w:t>
       </w:r>
     </w:p>
     <w:p>
@@ -1581,9 +1659,14 @@
       <w:r>
         <w:t>print(</w:t>
       </w:r>
+      <w:proofErr w:type="spellStart"/>
       <w:proofErr w:type="gramEnd"/>
       <w:r>
-        <w:t>i, j)</w:t>
+        <w:t>i</w:t>
+      </w:r>
+      <w:proofErr w:type="spellEnd"/>
+      <w:r>
+        <w:t>, j)</w:t>
       </w:r>
     </w:p>
     <w:p>
@@ -1641,34 +1724,52 @@
       <w:pPr>
         <w:spacing w:after="60"/>
       </w:pPr>
-      <w:r>
-        <w:t>new_arr = []</w:t>
-      </w:r>
-    </w:p>
-    <w:p>
-      <w:pPr>
-        <w:spacing w:after="60"/>
-      </w:pPr>
-    </w:p>
-    <w:p>
-      <w:pPr>
-        <w:spacing w:after="60"/>
-      </w:pPr>
-      <w:r>
-        <w:t>for x in arr:</w:t>
-      </w:r>
-    </w:p>
-    <w:p>
-      <w:pPr>
-        <w:spacing w:after="60"/>
-      </w:pPr>
-      <w:r>
-        <w:t xml:space="preserve">    new_</w:t>
+      <w:proofErr w:type="spellStart"/>
+      <w:r>
+        <w:t>new_arr</w:t>
+      </w:r>
+      <w:proofErr w:type="spellEnd"/>
+      <w:r>
+        <w:t xml:space="preserve"> = []</w:t>
+      </w:r>
+    </w:p>
+    <w:p>
+      <w:pPr>
+        <w:spacing w:after="60"/>
+      </w:pPr>
+    </w:p>
+    <w:p>
+      <w:pPr>
+        <w:spacing w:after="60"/>
+      </w:pPr>
+      <w:r>
+        <w:t xml:space="preserve">for x in </w:t>
+      </w:r>
+      <w:proofErr w:type="spellStart"/>
+      <w:r>
+        <w:t>arr</w:t>
+      </w:r>
+      <w:proofErr w:type="spellEnd"/>
+      <w:r>
+        <w:t>:</w:t>
+      </w:r>
+    </w:p>
+    <w:p>
+      <w:pPr>
+        <w:spacing w:after="60"/>
+      </w:pPr>
+      <w:r>
+        <w:t xml:space="preserve">    </w:t>
+      </w:r>
+      <w:proofErr w:type="spellStart"/>
+      <w:r>
+        <w:t>new_</w:t>
       </w:r>
       <w:proofErr w:type="gramStart"/>
       <w:r>
         <w:t>arr.append</w:t>
       </w:r>
+      <w:proofErr w:type="spellEnd"/>
       <w:proofErr w:type="gramEnd"/>
       <w:r>
         <w:t>(x)</w:t>
@@ -2030,7 +2131,7 @@
       </w:pPr>
       <w:r>
         <w:pict w14:anchorId="1A16B747">
-          <v:rect id="_x0000_i1049" style="width:0;height:1.5pt" o:hralign="center" o:hrstd="t" o:hr="t" fillcolor="#a0a0a0" stroked="f"/>
+          <v:rect id="_x0000_i1031" style="width:0;height:1.5pt" o:hralign="center" o:hrstd="t" o:hr="t" fillcolor="#a0a0a0" stroked="f"/>
         </w:pict>
       </w:r>
     </w:p>
@@ -2123,6 +2224,9 @@
         <w:spacing w:after="60"/>
       </w:pPr>
       <w:r>
+        <w:rPr>
+          <w:noProof/>
+        </w:rPr>
         <w:drawing>
           <wp:inline distT="0" distB="0" distL="0" distR="0" wp14:anchorId="1E32C157" wp14:editId="557EA2FD">
             <wp:extent cx="5076825" cy="2723381"/>
@@ -2166,7 +2270,7 @@
       </w:pPr>
       <w:r>
         <w:pict w14:anchorId="7481CDFF">
-          <v:rect id="_x0000_i1050" style="width:0;height:1.5pt" o:hralign="center" o:hrstd="t" o:hr="t" fillcolor="#a0a0a0" stroked="f"/>
+          <v:rect id="_x0000_i1032" style="width:0;height:1.5pt" o:hralign="center" o:hrstd="t" o:hr="t" fillcolor="#a0a0a0" stroked="f"/>
         </w:pict>
       </w:r>
     </w:p>
@@ -2275,7 +2379,7 @@
       <w:r>
         <w:lastRenderedPageBreak/>
         <w:pict w14:anchorId="32C89A1C">
-          <v:rect id="_x0000_i1051" style="width:0;height:1.5pt" o:hralign="center" o:hrstd="t" o:hr="t" fillcolor="#a0a0a0" stroked="f"/>
+          <v:rect id="_x0000_i1033" style="width:0;height:1.5pt" o:hralign="center" o:hrstd="t" o:hr="t" fillcolor="#a0a0a0" stroked="f"/>
         </w:pict>
       </w:r>
     </w:p>
@@ -2405,7 +2509,7 @@
       </w:pPr>
       <w:r>
         <w:pict w14:anchorId="5236BC84">
-          <v:rect id="_x0000_i1055" style="width:0;height:1.5pt" o:hralign="center" o:hrstd="t" o:hr="t" fillcolor="#a0a0a0" stroked="f"/>
+          <v:rect id="_x0000_i1034" style="width:0;height:1.5pt" o:hralign="center" o:hrstd="t" o:hr="t" fillcolor="#a0a0a0" stroked="f"/>
         </w:pict>
       </w:r>
     </w:p>
@@ -2742,6 +2846,7 @@
         <w:rPr>
           <w:b/>
           <w:bCs/>
+          <w:noProof/>
         </w:rPr>
         <w:drawing>
           <wp:inline distT="0" distB="0" distL="0" distR="0" wp14:anchorId="79F5B634" wp14:editId="7D967626">
@@ -2819,7 +2924,7 @@
       </w:pPr>
       <w:r>
         <w:pict w14:anchorId="1F23E615">
-          <v:rect id="_x0000_i1074" style="width:0;height:1.5pt" o:hralign="center" o:hrstd="t" o:hr="t" fillcolor="#a0a0a0" stroked="f"/>
+          <v:rect id="_x0000_i1035" style="width:0;height:1.5pt" o:hralign="center" o:hrstd="t" o:hr="t" fillcolor="#a0a0a0" stroked="f"/>
         </w:pict>
       </w:r>
     </w:p>
@@ -2871,6 +2976,9 @@
         <w:spacing w:after="60"/>
       </w:pPr>
       <w:r>
+        <w:rPr>
+          <w:noProof/>
+        </w:rPr>
         <w:drawing>
           <wp:inline distT="0" distB="0" distL="0" distR="0" wp14:anchorId="5779B5F4" wp14:editId="73462DCD">
             <wp:extent cx="2895851" cy="2476715"/>
@@ -2957,7 +3065,7 @@
       </w:pPr>
       <w:r>
         <w:pict w14:anchorId="3F3E8753">
-          <v:rect id="_x0000_i1075" style="width:0;height:1.5pt" o:hralign="center" o:hrstd="t" o:hr="t" fillcolor="#a0a0a0" stroked="f"/>
+          <v:rect id="_x0000_i1036" style="width:0;height:1.5pt" o:hralign="center" o:hrstd="t" o:hr="t" fillcolor="#a0a0a0" stroked="f"/>
         </w:pict>
       </w:r>
     </w:p>
@@ -3039,6 +3147,9 @@
         <w:spacing w:after="60"/>
       </w:pPr>
       <w:r>
+        <w:rPr>
+          <w:noProof/>
+        </w:rPr>
         <w:drawing>
           <wp:inline distT="0" distB="0" distL="0" distR="0" wp14:anchorId="12397C84" wp14:editId="780435F0">
             <wp:extent cx="5943600" cy="2708910"/>
@@ -3082,7 +3193,7 @@
       </w:pPr>
       <w:r>
         <w:pict w14:anchorId="5CDA50DE">
-          <v:rect id="_x0000_i1076" style="width:0;height:1.5pt" o:hralign="center" o:hrstd="t" o:hr="t" fillcolor="#a0a0a0" stroked="f"/>
+          <v:rect id="_x0000_i1037" style="width:0;height:1.5pt" o:hralign="center" o:hrstd="t" o:hr="t" fillcolor="#a0a0a0" stroked="f"/>
         </w:pict>
       </w:r>
     </w:p>
@@ -3140,8 +3251,21 @@
       <w:pPr>
         <w:spacing w:after="60"/>
       </w:pPr>
-      <w:r>
-        <w:t xml:space="preserve">arr[i]       → </w:t>
+      <w:proofErr w:type="spellStart"/>
+      <w:r>
+        <w:t>arr</w:t>
+      </w:r>
+      <w:proofErr w:type="spellEnd"/>
+      <w:r>
+        <w:t>[</w:t>
+      </w:r>
+      <w:proofErr w:type="spellStart"/>
+      <w:r>
+        <w:t>i</w:t>
+      </w:r>
+      <w:proofErr w:type="spellEnd"/>
+      <w:r>
+        <w:t xml:space="preserve">]       → </w:t>
       </w:r>
       <w:proofErr w:type="gramStart"/>
       <w:r>
@@ -3157,7 +3281,15 @@
         <w:spacing w:after="60"/>
       </w:pPr>
       <w:r>
-        <w:t>x in arr     → O(n)</w:t>
+        <w:t xml:space="preserve">x in </w:t>
+      </w:r>
+      <w:proofErr w:type="spellStart"/>
+      <w:r>
+        <w:t>arr</w:t>
+      </w:r>
+      <w:proofErr w:type="spellEnd"/>
+      <w:r>
+        <w:t xml:space="preserve">     → O(n)</w:t>
       </w:r>
     </w:p>
     <w:p>
@@ -3366,7 +3498,15 @@
         <w:spacing w:after="60"/>
       </w:pPr>
       <w:r>
-        <w:t>if x in arr:</w:t>
+        <w:t xml:space="preserve">if x in </w:t>
+      </w:r>
+      <w:proofErr w:type="spellStart"/>
+      <w:r>
+        <w:t>arr</w:t>
+      </w:r>
+      <w:proofErr w:type="spellEnd"/>
+      <w:r>
+        <w:t>:</w:t>
       </w:r>
     </w:p>
     <w:p>
@@ -3397,7 +3537,15 @@
         <w:spacing w:after="60"/>
       </w:pPr>
       <w:r>
-        <w:t>if x in my_set:</w:t>
+        <w:t xml:space="preserve">if x in </w:t>
+      </w:r>
+      <w:proofErr w:type="spellStart"/>
+      <w:r>
+        <w:t>my_set</w:t>
+      </w:r>
+      <w:proofErr w:type="spellEnd"/>
+      <w:r>
+        <w:t>:</w:t>
       </w:r>
     </w:p>
     <w:p>
@@ -3437,7 +3585,23 @@
           <w:b/>
           <w:bCs/>
         </w:rPr>
-        <w:t>optimizing LeetCode solutions and avoiding TLE</w:t>
+        <w:t xml:space="preserve">optimizing </w:t>
+      </w:r>
+      <w:proofErr w:type="spellStart"/>
+      <w:r>
+        <w:rPr>
+          <w:b/>
+          <w:bCs/>
+        </w:rPr>
+        <w:t>LeetCode</w:t>
+      </w:r>
+      <w:proofErr w:type="spellEnd"/>
+      <w:r>
+        <w:rPr>
+          <w:b/>
+          <w:bCs/>
+        </w:rPr>
+        <w:t xml:space="preserve"> solutions and avoiding TLE</w:t>
       </w:r>
       <w:r>
         <w:t>.</w:t>
@@ -3449,7 +3613,7 @@
       </w:pPr>
       <w:r>
         <w:pict w14:anchorId="342C95F9">
-          <v:rect id="_x0000_i1080" style="width:0;height:1.5pt" o:hralign="center" o:hrstd="t" o:hr="t" fillcolor="#a0a0a0" stroked="f"/>
+          <v:rect id="_x0000_i1038" style="width:0;height:1.5pt" o:hralign="center" o:hrstd="t" o:hr="t" fillcolor="#a0a0a0" stroked="f"/>
         </w:pict>
       </w:r>
     </w:p>
@@ -3515,8 +3679,21 @@
       <w:pPr>
         <w:spacing w:after="60"/>
       </w:pPr>
-      <w:r>
-        <w:t>last_digit = num % 10</w:t>
+      <w:proofErr w:type="spellStart"/>
+      <w:r>
+        <w:t>last_digit</w:t>
+      </w:r>
+      <w:proofErr w:type="spellEnd"/>
+      <w:r>
+        <w:t xml:space="preserve"> = </w:t>
+      </w:r>
+      <w:proofErr w:type="spellStart"/>
+      <w:r>
+        <w:t>num</w:t>
+      </w:r>
+      <w:proofErr w:type="spellEnd"/>
+      <w:r>
+        <w:t xml:space="preserve"> % 10</w:t>
       </w:r>
     </w:p>
     <w:p>
@@ -3573,8 +3750,21 @@
       <w:pPr>
         <w:spacing w:after="60"/>
       </w:pPr>
-      <w:r>
-        <w:t>num = num // 10</w:t>
+      <w:proofErr w:type="spellStart"/>
+      <w:r>
+        <w:t>num</w:t>
+      </w:r>
+      <w:proofErr w:type="spellEnd"/>
+      <w:r>
+        <w:t xml:space="preserve"> = </w:t>
+      </w:r>
+      <w:proofErr w:type="spellStart"/>
+      <w:r>
+        <w:t>num</w:t>
+      </w:r>
+      <w:proofErr w:type="spellEnd"/>
+      <w:r>
+        <w:t xml:space="preserve"> // 10</w:t>
       </w:r>
     </w:p>
     <w:p>
@@ -3632,31 +3822,76 @@
         <w:spacing w:after="60"/>
       </w:pPr>
       <w:r>
-        <w:t>while num &gt; 0:</w:t>
-      </w:r>
-    </w:p>
-    <w:p>
-      <w:pPr>
-        <w:spacing w:after="60"/>
-      </w:pPr>
-      <w:r>
-        <w:t xml:space="preserve">    last_digit = num % 10</w:t>
-      </w:r>
-    </w:p>
-    <w:p>
-      <w:pPr>
-        <w:spacing w:after="60"/>
-      </w:pPr>
-      <w:r>
-        <w:t xml:space="preserve">    # process last_digit</w:t>
-      </w:r>
-    </w:p>
-    <w:p>
-      <w:pPr>
-        <w:spacing w:after="60"/>
-      </w:pPr>
-      <w:r>
-        <w:t xml:space="preserve">    num = num // 10</w:t>
+        <w:t xml:space="preserve">while </w:t>
+      </w:r>
+      <w:proofErr w:type="spellStart"/>
+      <w:r>
+        <w:t>num</w:t>
+      </w:r>
+      <w:proofErr w:type="spellEnd"/>
+      <w:r>
+        <w:t xml:space="preserve"> &gt; 0:</w:t>
+      </w:r>
+    </w:p>
+    <w:p>
+      <w:pPr>
+        <w:spacing w:after="60"/>
+      </w:pPr>
+      <w:r>
+        <w:t xml:space="preserve">    </w:t>
+      </w:r>
+      <w:proofErr w:type="spellStart"/>
+      <w:r>
+        <w:t>last_digit</w:t>
+      </w:r>
+      <w:proofErr w:type="spellEnd"/>
+      <w:r>
+        <w:t xml:space="preserve"> = </w:t>
+      </w:r>
+      <w:proofErr w:type="spellStart"/>
+      <w:r>
+        <w:t>num</w:t>
+      </w:r>
+      <w:proofErr w:type="spellEnd"/>
+      <w:r>
+        <w:t xml:space="preserve"> % 10</w:t>
+      </w:r>
+    </w:p>
+    <w:p>
+      <w:pPr>
+        <w:spacing w:after="60"/>
+      </w:pPr>
+      <w:r>
+        <w:t xml:space="preserve">    # process </w:t>
+      </w:r>
+      <w:proofErr w:type="spellStart"/>
+      <w:r>
+        <w:t>last_digit</w:t>
+      </w:r>
+      <w:proofErr w:type="spellEnd"/>
+    </w:p>
+    <w:p>
+      <w:pPr>
+        <w:spacing w:after="60"/>
+      </w:pPr>
+      <w:r>
+        <w:t xml:space="preserve">    </w:t>
+      </w:r>
+      <w:proofErr w:type="spellStart"/>
+      <w:r>
+        <w:t>num</w:t>
+      </w:r>
+      <w:proofErr w:type="spellEnd"/>
+      <w:r>
+        <w:t xml:space="preserve"> = </w:t>
+      </w:r>
+      <w:proofErr w:type="spellStart"/>
+      <w:r>
+        <w:t>num</w:t>
+      </w:r>
+      <w:proofErr w:type="spellEnd"/>
+      <w:r>
+        <w:t xml:space="preserve"> // 10</w:t>
       </w:r>
     </w:p>
     <w:p>
@@ -3665,7 +3900,7 @@
       </w:pPr>
       <w:r>
         <w:pict w14:anchorId="5FC98A9C">
-          <v:rect id="_x0000_i1141" style="width:0;height:1.5pt" o:hralign="center" o:hrstd="t" o:hr="t" fillcolor="#a0a0a0" stroked="f"/>
+          <v:rect id="_x0000_i1039" style="width:0;height:1.5pt" o:hralign="center" o:hrstd="t" o:hr="t" fillcolor="#a0a0a0" stroked="f"/>
         </w:pict>
       </w:r>
     </w:p>
@@ -3760,7 +3995,7 @@
       </w:pPr>
       <w:r>
         <w:pict w14:anchorId="51D7620E">
-          <v:rect id="_x0000_i1142" style="width:0;height:1.5pt" o:hralign="center" o:hrstd="t" o:hr="t" fillcolor="#a0a0a0" stroked="f"/>
+          <v:rect id="_x0000_i1040" style="width:0;height:1.5pt" o:hralign="center" o:hrstd="t" o:hr="t" fillcolor="#a0a0a0" stroked="f"/>
         </w:pict>
       </w:r>
     </w:p>
@@ -3792,66 +4027,127 @@
       <w:pPr>
         <w:spacing w:after="60"/>
       </w:pPr>
-      <w:r>
-        <w:t>num = n</w:t>
-      </w:r>
-    </w:p>
-    <w:p>
-      <w:pPr>
-        <w:spacing w:after="60"/>
-      </w:pPr>
-    </w:p>
-    <w:p>
-      <w:pPr>
-        <w:spacing w:after="60"/>
-      </w:pPr>
-      <w:r>
-        <w:t>while num &gt; 0:</w:t>
-      </w:r>
-    </w:p>
-    <w:p>
-      <w:pPr>
-        <w:spacing w:after="60"/>
-      </w:pPr>
-      <w:r>
-        <w:t xml:space="preserve">    last_digit = num % 10</w:t>
-      </w:r>
-    </w:p>
-    <w:p>
-      <w:pPr>
-        <w:spacing w:after="60"/>
-      </w:pPr>
-      <w:r>
-        <w:t xml:space="preserve">    print(last_digit)</w:t>
-      </w:r>
-    </w:p>
-    <w:p>
-      <w:pPr>
-        <w:spacing w:after="60"/>
-      </w:pPr>
-    </w:p>
-    <w:p>
-      <w:pPr>
-        <w:spacing w:after="60"/>
-      </w:pPr>
-      <w:r>
-        <w:t xml:space="preserve">    num //= 10</w:t>
-      </w:r>
-    </w:p>
-    <w:p>
-      <w:pPr>
-        <w:spacing w:after="60"/>
-        <w:rPr>
-          <w:b/>
-          <w:bCs/>
-        </w:rPr>
-      </w:pPr>
-      <w:r>
-        <w:rPr>
-          <w:b/>
-          <w:bCs/>
-        </w:rPr>
-        <w:t>Why num = n?</w:t>
+      <w:proofErr w:type="spellStart"/>
+      <w:r>
+        <w:t>num</w:t>
+      </w:r>
+      <w:proofErr w:type="spellEnd"/>
+      <w:r>
+        <w:t xml:space="preserve"> = n</w:t>
+      </w:r>
+    </w:p>
+    <w:p>
+      <w:pPr>
+        <w:spacing w:after="60"/>
+      </w:pPr>
+    </w:p>
+    <w:p>
+      <w:pPr>
+        <w:spacing w:after="60"/>
+      </w:pPr>
+      <w:r>
+        <w:t xml:space="preserve">while </w:t>
+      </w:r>
+      <w:proofErr w:type="spellStart"/>
+      <w:r>
+        <w:t>num</w:t>
+      </w:r>
+      <w:proofErr w:type="spellEnd"/>
+      <w:r>
+        <w:t xml:space="preserve"> &gt; 0:</w:t>
+      </w:r>
+    </w:p>
+    <w:p>
+      <w:pPr>
+        <w:spacing w:after="60"/>
+      </w:pPr>
+      <w:r>
+        <w:t xml:space="preserve">    </w:t>
+      </w:r>
+      <w:proofErr w:type="spellStart"/>
+      <w:r>
+        <w:t>last_digit</w:t>
+      </w:r>
+      <w:proofErr w:type="spellEnd"/>
+      <w:r>
+        <w:t xml:space="preserve"> = </w:t>
+      </w:r>
+      <w:proofErr w:type="spellStart"/>
+      <w:r>
+        <w:t>num</w:t>
+      </w:r>
+      <w:proofErr w:type="spellEnd"/>
+      <w:r>
+        <w:t xml:space="preserve"> % 10</w:t>
+      </w:r>
+    </w:p>
+    <w:p>
+      <w:pPr>
+        <w:spacing w:after="60"/>
+      </w:pPr>
+      <w:r>
+        <w:t xml:space="preserve">    print(</w:t>
+      </w:r>
+      <w:proofErr w:type="spellStart"/>
+      <w:r>
+        <w:t>last_digit</w:t>
+      </w:r>
+      <w:proofErr w:type="spellEnd"/>
+      <w:r>
+        <w:t>)</w:t>
+      </w:r>
+    </w:p>
+    <w:p>
+      <w:pPr>
+        <w:spacing w:after="60"/>
+      </w:pPr>
+    </w:p>
+    <w:p>
+      <w:pPr>
+        <w:spacing w:after="60"/>
+      </w:pPr>
+      <w:r>
+        <w:t xml:space="preserve">    </w:t>
+      </w:r>
+      <w:proofErr w:type="spellStart"/>
+      <w:r>
+        <w:t>num</w:t>
+      </w:r>
+      <w:proofErr w:type="spellEnd"/>
+      <w:r>
+        <w:t xml:space="preserve"> //= 10</w:t>
+      </w:r>
+    </w:p>
+    <w:p>
+      <w:pPr>
+        <w:spacing w:after="60"/>
+        <w:rPr>
+          <w:b/>
+          <w:bCs/>
+        </w:rPr>
+      </w:pPr>
+      <w:r>
+        <w:rPr>
+          <w:b/>
+          <w:bCs/>
+        </w:rPr>
+        <w:t xml:space="preserve">Why </w:t>
+      </w:r>
+      <w:proofErr w:type="spellStart"/>
+      <w:r>
+        <w:rPr>
+          <w:b/>
+          <w:bCs/>
+        </w:rPr>
+        <w:t>num</w:t>
+      </w:r>
+      <w:proofErr w:type="spellEnd"/>
+      <w:r>
+        <w:rPr>
+          <w:b/>
+          <w:bCs/>
+        </w:rPr>
+        <w:t xml:space="preserve"> = n?</w:t>
       </w:r>
     </w:p>
     <w:p>
@@ -3868,7 +4164,7 @@
       </w:pPr>
       <w:r>
         <w:pict w14:anchorId="4ED995B1">
-          <v:rect id="_x0000_i1143" style="width:0;height:1.5pt" o:hralign="center" o:hrstd="t" o:hr="t" fillcolor="#a0a0a0" stroked="f"/>
+          <v:rect id="_x0000_i1041" style="width:0;height:1.5pt" o:hralign="center" o:hrstd="t" o:hr="t" fillcolor="#a0a0a0" stroked="f"/>
         </w:pict>
       </w:r>
     </w:p>
@@ -4002,7 +4298,7 @@
       </w:pPr>
       <w:r>
         <w:pict w14:anchorId="0C5082A4">
-          <v:rect id="_x0000_i1144" style="width:0;height:1.5pt" o:hralign="center" o:hrstd="t" o:hr="t" fillcolor="#a0a0a0" stroked="f"/>
+          <v:rect id="_x0000_i1042" style="width:0;height:1.5pt" o:hralign="center" o:hrstd="t" o:hr="t" fillcolor="#a0a0a0" stroked="f"/>
         </w:pict>
       </w:r>
     </w:p>
@@ -4189,6 +4485,9 @@
         <w:spacing w:after="60"/>
       </w:pPr>
       <w:r>
+        <w:rPr>
+          <w:noProof/>
+        </w:rPr>
         <w:drawing>
           <wp:inline distT="0" distB="0" distL="0" distR="0" wp14:anchorId="48E43047" wp14:editId="751CE310">
             <wp:extent cx="5608806" cy="3696020"/>
@@ -4246,6 +4545,9 @@
         <w:t xml:space="preserve"> </w:t>
       </w:r>
       <w:r>
+        <w:rPr>
+          <w:noProof/>
+        </w:rPr>
         <w:drawing>
           <wp:inline distT="0" distB="0" distL="0" distR="0" wp14:anchorId="15289174" wp14:editId="5060C6BD">
             <wp:extent cx="4915326" cy="3482642"/>
@@ -4302,18 +4604,24 @@
       </w:r>
       <w:proofErr w:type="gramStart"/>
       <w:r>
-        <w:t>):-</w:t>
+        <w:t>)</w:t>
+      </w:r>
+      <w:r>
+        <w:t xml:space="preserve"> :</w:t>
       </w:r>
       <w:proofErr w:type="gramEnd"/>
       <w:r>
-        <w:t xml:space="preserve"> </w:t>
-      </w:r>
-    </w:p>
-    <w:p>
-      <w:pPr>
-        <w:spacing w:after="60"/>
-      </w:pPr>
-      <w:r>
+        <w:t>-</w:t>
+      </w:r>
+    </w:p>
+    <w:p>
+      <w:pPr>
+        <w:spacing w:after="60"/>
+      </w:pPr>
+      <w:r>
+        <w:rPr>
+          <w:noProof/>
+        </w:rPr>
         <w:drawing>
           <wp:inline distT="0" distB="0" distL="0" distR="0" wp14:anchorId="70A6449C" wp14:editId="2BE107A9">
             <wp:extent cx="5943600" cy="2186305"/>
@@ -4404,22 +4712,1466 @@
     <w:p>
       <w:pPr>
         <w:spacing w:after="60"/>
-      </w:pPr>
-    </w:p>
-    <w:p>
-      <w:pPr>
-        <w:spacing w:after="60"/>
-      </w:pPr>
-    </w:p>
-    <w:p>
-      <w:pPr>
-        <w:spacing w:after="60"/>
-      </w:pPr>
-    </w:p>
-    <w:p>
-      <w:pPr>
-        <w:spacing w:after="60"/>
-      </w:pPr>
+        <w:rPr>
+          <w:b/>
+          <w:bCs/>
+        </w:rPr>
+      </w:pPr>
+      <w:r>
+        <w:rPr>
+          <w:b/>
+          <w:bCs/>
+          <w:highlight w:val="yellow"/>
+        </w:rPr>
+        <w:t xml:space="preserve">Palindrome </w:t>
+      </w:r>
+      <w:proofErr w:type="gramStart"/>
+      <w:r>
+        <w:rPr>
+          <w:b/>
+          <w:bCs/>
+          <w:highlight w:val="yellow"/>
+        </w:rPr>
+        <w:t>Number</w:t>
+      </w:r>
+      <w:r>
+        <w:rPr>
+          <w:b/>
+          <w:bCs/>
+        </w:rPr>
+        <w:t>:-</w:t>
+      </w:r>
+      <w:proofErr w:type="gramEnd"/>
+    </w:p>
+    <w:p>
+      <w:pPr>
+        <w:spacing w:after="60"/>
+        <w:rPr>
+          <w:b/>
+          <w:bCs/>
+        </w:rPr>
+      </w:pPr>
+      <w:r>
+        <w:rPr>
+          <w:b/>
+          <w:bCs/>
+        </w:rPr>
+        <w:t>Key Concepts</w:t>
+      </w:r>
+    </w:p>
+    <w:p>
+      <w:pPr>
+        <w:numPr>
+          <w:ilvl w:val="0"/>
+          <w:numId w:val="9"/>
+        </w:numPr>
+        <w:spacing w:after="60"/>
+      </w:pPr>
+      <w:r>
+        <w:rPr>
+          <w:b/>
+          <w:bCs/>
+        </w:rPr>
+        <w:t>Definition:</w:t>
+      </w:r>
+      <w:r>
+        <w:t xml:space="preserve"> A palindrome is a number that remains the same when read forward and backward (e.g., </w:t>
+      </w:r>
+      <w:r>
+        <w:rPr>
+          <w:b/>
+          <w:bCs/>
+        </w:rPr>
+        <w:t>121</w:t>
+      </w:r>
+      <w:r>
+        <w:t xml:space="preserve">, </w:t>
+      </w:r>
+      <w:r>
+        <w:rPr>
+          <w:b/>
+          <w:bCs/>
+        </w:rPr>
+        <w:t>1331</w:t>
+      </w:r>
+      <w:r>
+        <w:t xml:space="preserve">). </w:t>
+      </w:r>
+    </w:p>
+    <w:p>
+      <w:pPr>
+        <w:numPr>
+          <w:ilvl w:val="0"/>
+          <w:numId w:val="9"/>
+        </w:numPr>
+        <w:spacing w:after="60"/>
+      </w:pPr>
+      <w:r>
+        <w:rPr>
+          <w:b/>
+          <w:bCs/>
+        </w:rPr>
+        <w:t>Approach:</w:t>
+      </w:r>
+      <w:r>
+        <w:t xml:space="preserve"> Avoid string conversion. Instead, </w:t>
+      </w:r>
+      <w:r>
+        <w:rPr>
+          <w:b/>
+          <w:bCs/>
+        </w:rPr>
+        <w:t>reverse the digits mathematically</w:t>
+      </w:r>
+      <w:r>
+        <w:t xml:space="preserve"> and compare the reversed number with the original. </w:t>
+      </w:r>
+    </w:p>
+    <w:p>
+      <w:pPr>
+        <w:spacing w:after="60"/>
+      </w:pPr>
+      <w:r>
+        <w:pict w14:anchorId="6A552FCD">
+          <v:rect id="_x0000_i1067" style="width:0;height:1.5pt" o:hralign="center" o:hrstd="t" o:hr="t" fillcolor="#a0a0a0" stroked="f"/>
+        </w:pict>
+      </w:r>
+    </w:p>
+    <w:p>
+      <w:pPr>
+        <w:spacing w:after="60"/>
+        <w:rPr>
+          <w:b/>
+          <w:bCs/>
+        </w:rPr>
+      </w:pPr>
+      <w:r>
+        <w:rPr>
+          <w:b/>
+          <w:bCs/>
+        </w:rPr>
+        <w:t>Step-by-Step Logic</w:t>
+      </w:r>
+    </w:p>
+    <w:p>
+      <w:pPr>
+        <w:numPr>
+          <w:ilvl w:val="0"/>
+          <w:numId w:val="10"/>
+        </w:numPr>
+        <w:spacing w:after="60"/>
+      </w:pPr>
+      <w:r>
+        <w:rPr>
+          <w:b/>
+          <w:bCs/>
+        </w:rPr>
+        <w:t>Store the original number:</w:t>
+      </w:r>
+      <w:r>
+        <w:t xml:space="preserve"> Keep a copy because </w:t>
+      </w:r>
+      <w:proofErr w:type="spellStart"/>
+      <w:r>
+        <w:t>num</w:t>
+      </w:r>
+      <w:proofErr w:type="spellEnd"/>
+      <w:r>
+        <w:t xml:space="preserve"> will be modified. </w:t>
+      </w:r>
+    </w:p>
+    <w:p>
+      <w:pPr>
+        <w:numPr>
+          <w:ilvl w:val="0"/>
+          <w:numId w:val="10"/>
+        </w:numPr>
+        <w:spacing w:after="60"/>
+      </w:pPr>
+      <w:r>
+        <w:rPr>
+          <w:b/>
+          <w:bCs/>
+        </w:rPr>
+        <w:t>Extract the last digit:</w:t>
+      </w:r>
+      <w:r>
+        <w:t xml:space="preserve"> Use </w:t>
+      </w:r>
+      <w:proofErr w:type="spellStart"/>
+      <w:r>
+        <w:t>num</w:t>
+      </w:r>
+      <w:proofErr w:type="spellEnd"/>
+      <w:r>
+        <w:t xml:space="preserve"> % 10. </w:t>
+      </w:r>
+    </w:p>
+    <w:p>
+      <w:pPr>
+        <w:numPr>
+          <w:ilvl w:val="0"/>
+          <w:numId w:val="10"/>
+        </w:numPr>
+        <w:spacing w:after="60"/>
+      </w:pPr>
+      <w:r>
+        <w:rPr>
+          <w:b/>
+          <w:bCs/>
+        </w:rPr>
+        <w:t>Build the reverse:</w:t>
+      </w:r>
+      <w:r>
+        <w:t xml:space="preserve"> Use result * 10 + </w:t>
+      </w:r>
+      <w:proofErr w:type="spellStart"/>
+      <w:r>
+        <w:t>last_digit</w:t>
+      </w:r>
+      <w:proofErr w:type="spellEnd"/>
+      <w:r>
+        <w:t xml:space="preserve">. </w:t>
+      </w:r>
+    </w:p>
+    <w:p>
+      <w:pPr>
+        <w:numPr>
+          <w:ilvl w:val="0"/>
+          <w:numId w:val="10"/>
+        </w:numPr>
+        <w:spacing w:after="60"/>
+      </w:pPr>
+      <w:r>
+        <w:rPr>
+          <w:b/>
+          <w:bCs/>
+        </w:rPr>
+        <w:t>Remove the last digit:</w:t>
+      </w:r>
+      <w:r>
+        <w:t xml:space="preserve"> Use </w:t>
+      </w:r>
+      <w:proofErr w:type="spellStart"/>
+      <w:r>
+        <w:t>num</w:t>
+      </w:r>
+      <w:proofErr w:type="spellEnd"/>
+      <w:r>
+        <w:t xml:space="preserve"> // 10. </w:t>
+      </w:r>
+    </w:p>
+    <w:p>
+      <w:pPr>
+        <w:numPr>
+          <w:ilvl w:val="0"/>
+          <w:numId w:val="10"/>
+        </w:numPr>
+        <w:spacing w:after="60"/>
+      </w:pPr>
+      <w:r>
+        <w:rPr>
+          <w:b/>
+          <w:bCs/>
+        </w:rPr>
+        <w:t>Compare:</w:t>
+      </w:r>
+      <w:r>
+        <w:t xml:space="preserve"> If the original number equals result, it is a palindrome. </w:t>
+      </w:r>
+    </w:p>
+    <w:p>
+      <w:pPr>
+        <w:spacing w:after="60"/>
+      </w:pPr>
+      <w:r>
+        <w:pict w14:anchorId="6117ACF4">
+          <v:rect id="_x0000_i1068" style="width:0;height:1.5pt" o:hralign="center" o:hrstd="t" o:hr="t" fillcolor="#a0a0a0" stroked="f"/>
+        </w:pict>
+      </w:r>
+    </w:p>
+    <w:p>
+      <w:pPr>
+        <w:spacing w:after="60"/>
+        <w:rPr>
+          <w:b/>
+          <w:bCs/>
+        </w:rPr>
+      </w:pPr>
+      <w:r>
+        <w:rPr>
+          <w:b/>
+          <w:bCs/>
+        </w:rPr>
+        <w:t xml:space="preserve">Code </w:t>
+      </w:r>
+      <w:proofErr w:type="gramStart"/>
+      <w:r>
+        <w:rPr>
+          <w:b/>
+          <w:bCs/>
+        </w:rPr>
+        <w:t>Structure</w:t>
+      </w:r>
+      <w:r>
+        <w:rPr>
+          <w:b/>
+          <w:bCs/>
+        </w:rPr>
+        <w:t>:-</w:t>
+      </w:r>
+      <w:proofErr w:type="gramEnd"/>
+    </w:p>
+    <w:p>
+      <w:pPr>
+        <w:spacing w:after="60"/>
+      </w:pPr>
+      <w:r>
+        <w:t>n = 121</w:t>
+      </w:r>
+    </w:p>
+    <w:p>
+      <w:pPr>
+        <w:spacing w:after="60"/>
+      </w:pPr>
+      <w:proofErr w:type="spellStart"/>
+      <w:r>
+        <w:t>num</w:t>
+      </w:r>
+      <w:proofErr w:type="spellEnd"/>
+      <w:r>
+        <w:t xml:space="preserve"> = n</w:t>
+      </w:r>
+    </w:p>
+    <w:p>
+      <w:pPr>
+        <w:spacing w:after="60"/>
+      </w:pPr>
+      <w:r>
+        <w:t>result = 0</w:t>
+      </w:r>
+    </w:p>
+    <w:p>
+      <w:pPr>
+        <w:spacing w:after="60"/>
+      </w:pPr>
+    </w:p>
+    <w:p>
+      <w:pPr>
+        <w:spacing w:after="60"/>
+      </w:pPr>
+      <w:r>
+        <w:t xml:space="preserve">while </w:t>
+      </w:r>
+      <w:proofErr w:type="spellStart"/>
+      <w:r>
+        <w:t>num</w:t>
+      </w:r>
+      <w:proofErr w:type="spellEnd"/>
+      <w:r>
+        <w:t xml:space="preserve"> &gt; 0:</w:t>
+      </w:r>
+    </w:p>
+    <w:p>
+      <w:pPr>
+        <w:spacing w:after="60"/>
+      </w:pPr>
+      <w:r>
+        <w:t xml:space="preserve">    </w:t>
+      </w:r>
+      <w:proofErr w:type="spellStart"/>
+      <w:r>
+        <w:t>last_digit</w:t>
+      </w:r>
+      <w:proofErr w:type="spellEnd"/>
+      <w:r>
+        <w:t xml:space="preserve"> = </w:t>
+      </w:r>
+      <w:proofErr w:type="spellStart"/>
+      <w:r>
+        <w:t>num</w:t>
+      </w:r>
+      <w:proofErr w:type="spellEnd"/>
+      <w:r>
+        <w:t xml:space="preserve"> % 10</w:t>
+      </w:r>
+    </w:p>
+    <w:p>
+      <w:pPr>
+        <w:spacing w:after="60"/>
+      </w:pPr>
+      <w:r>
+        <w:t xml:space="preserve">    result = result * 10 + </w:t>
+      </w:r>
+      <w:proofErr w:type="spellStart"/>
+      <w:r>
+        <w:t>last_digit</w:t>
+      </w:r>
+      <w:proofErr w:type="spellEnd"/>
+    </w:p>
+    <w:p>
+      <w:pPr>
+        <w:spacing w:after="60"/>
+      </w:pPr>
+      <w:r>
+        <w:t xml:space="preserve">    </w:t>
+      </w:r>
+      <w:proofErr w:type="spellStart"/>
+      <w:r>
+        <w:t>num</w:t>
+      </w:r>
+      <w:proofErr w:type="spellEnd"/>
+      <w:r>
+        <w:t xml:space="preserve"> //= 10</w:t>
+      </w:r>
+    </w:p>
+    <w:p>
+      <w:pPr>
+        <w:spacing w:after="60"/>
+      </w:pPr>
+    </w:p>
+    <w:p>
+      <w:pPr>
+        <w:spacing w:after="60"/>
+      </w:pPr>
+      <w:r>
+        <w:t>if n == result:</w:t>
+      </w:r>
+    </w:p>
+    <w:p>
+      <w:pPr>
+        <w:spacing w:after="60"/>
+      </w:pPr>
+      <w:r>
+        <w:t xml:space="preserve">    print("Palindrome")</w:t>
+      </w:r>
+    </w:p>
+    <w:p>
+      <w:pPr>
+        <w:spacing w:after="60"/>
+      </w:pPr>
+      <w:r>
+        <w:t>else:</w:t>
+      </w:r>
+    </w:p>
+    <w:p>
+      <w:pPr>
+        <w:spacing w:after="60"/>
+      </w:pPr>
+      <w:r>
+        <w:t xml:space="preserve">    </w:t>
+      </w:r>
+      <w:proofErr w:type="gramStart"/>
+      <w:r>
+        <w:t>print(</w:t>
+      </w:r>
+      <w:proofErr w:type="gramEnd"/>
+      <w:r>
+        <w:t>"Not Palindrome")</w:t>
+      </w:r>
+    </w:p>
+    <w:p>
+      <w:pPr>
+        <w:spacing w:after="60"/>
+        <w:rPr>
+          <w:b/>
+          <w:bCs/>
+        </w:rPr>
+      </w:pPr>
+      <w:r>
+        <w:rPr>
+          <w:b/>
+          <w:bCs/>
+        </w:rPr>
+        <w:t>Example: 121</w:t>
+      </w:r>
+    </w:p>
+    <w:p>
+      <w:pPr>
+        <w:spacing w:after="60"/>
+      </w:pPr>
+      <w:r>
+        <w:t>121 → digit 1 → result = 1</w:t>
+      </w:r>
+    </w:p>
+    <w:p>
+      <w:pPr>
+        <w:spacing w:after="60"/>
+      </w:pPr>
+      <w:proofErr w:type="gramStart"/>
+      <w:r>
+        <w:t>12  →</w:t>
+      </w:r>
+      <w:proofErr w:type="gramEnd"/>
+      <w:r>
+        <w:t xml:space="preserve"> digit 2 → result = 12</w:t>
+      </w:r>
+    </w:p>
+    <w:p>
+      <w:pPr>
+        <w:spacing w:after="60"/>
+      </w:pPr>
+      <w:r>
+        <w:t>1   → digit 1 → result = 121</w:t>
+      </w:r>
+    </w:p>
+    <w:p>
+      <w:pPr>
+        <w:spacing w:after="60"/>
+      </w:pPr>
+      <w:r>
+        <w:t>0   → stop</w:t>
+      </w:r>
+    </w:p>
+    <w:p>
+      <w:pPr>
+        <w:spacing w:after="60"/>
+      </w:pPr>
+      <w:r>
+        <w:t>Original = 121</w:t>
+      </w:r>
+      <w:r>
+        <w:br/>
+        <w:t>Reverse = 121</w:t>
+      </w:r>
+    </w:p>
+    <w:p>
+      <w:pPr>
+        <w:spacing w:after="60"/>
+      </w:pPr>
+      <w:r>
+        <w:t xml:space="preserve">Therefore, </w:t>
+      </w:r>
+      <w:r>
+        <w:rPr>
+          <w:b/>
+          <w:bCs/>
+        </w:rPr>
+        <w:t>121 is a Palindrome</w:t>
+      </w:r>
+      <w:r>
+        <w:t>.</w:t>
+      </w:r>
+    </w:p>
+    <w:p>
+      <w:pPr>
+        <w:spacing w:after="60"/>
+      </w:pPr>
+      <w:r>
+        <w:pict w14:anchorId="6452F28B">
+          <v:rect id="_x0000_i1069" style="width:0;height:1.5pt" o:hralign="center" o:hrstd="t" o:hr="t" fillcolor="#a0a0a0" stroked="f"/>
+        </w:pict>
+      </w:r>
+    </w:p>
+    <w:p>
+      <w:pPr>
+        <w:spacing w:after="60"/>
+        <w:rPr>
+          <w:b/>
+          <w:bCs/>
+        </w:rPr>
+      </w:pPr>
+      <w:r>
+        <w:rPr>
+          <w:b/>
+          <w:bCs/>
+        </w:rPr>
+        <w:t>Complexity Analysis</w:t>
+      </w:r>
+    </w:p>
+    <w:p>
+      <w:pPr>
+        <w:spacing w:after="60"/>
+      </w:pPr>
+      <w:r>
+        <w:t>If the number has d digits:</w:t>
+      </w:r>
+    </w:p>
+    <w:p>
+      <w:pPr>
+        <w:numPr>
+          <w:ilvl w:val="0"/>
+          <w:numId w:val="11"/>
+        </w:numPr>
+        <w:spacing w:after="60"/>
+      </w:pPr>
+      <w:r>
+        <w:rPr>
+          <w:b/>
+          <w:bCs/>
+        </w:rPr>
+        <w:t>Time Complexity:</w:t>
+      </w:r>
+      <w:r>
+        <w:t xml:space="preserve"> O(d) or </w:t>
+      </w:r>
+      <w:proofErr w:type="gramStart"/>
+      <w:r>
+        <w:rPr>
+          <w:b/>
+          <w:bCs/>
+        </w:rPr>
+        <w:t>O(</w:t>
+      </w:r>
+      <w:proofErr w:type="gramEnd"/>
+      <w:r>
+        <w:rPr>
+          <w:b/>
+          <w:bCs/>
+        </w:rPr>
+        <w:t>log n)</w:t>
+      </w:r>
+      <w:r>
+        <w:t xml:space="preserve"> </w:t>
+      </w:r>
+    </w:p>
+    <w:p>
+      <w:pPr>
+        <w:numPr>
+          <w:ilvl w:val="0"/>
+          <w:numId w:val="11"/>
+        </w:numPr>
+        <w:spacing w:after="60"/>
+      </w:pPr>
+      <w:r>
+        <w:rPr>
+          <w:b/>
+          <w:bCs/>
+        </w:rPr>
+        <w:t>Space Complexity:</w:t>
+      </w:r>
+      <w:r>
+        <w:t xml:space="preserve"> </w:t>
+      </w:r>
+      <w:proofErr w:type="gramStart"/>
+      <w:r>
+        <w:t>O(</w:t>
+      </w:r>
+      <w:proofErr w:type="gramEnd"/>
+      <w:r>
+        <w:t xml:space="preserve">1) — Constant space </w:t>
+      </w:r>
+    </w:p>
+    <w:p>
+      <w:pPr>
+        <w:spacing w:after="60"/>
+      </w:pPr>
+      <w:r>
+        <w:pict w14:anchorId="5D2F9988">
+          <v:rect id="_x0000_i1070" style="width:0;height:1.5pt" o:hralign="center" o:hrstd="t" o:hr="t" fillcolor="#a0a0a0" stroked="f"/>
+        </w:pict>
+      </w:r>
+    </w:p>
+    <w:p>
+      <w:pPr>
+        <w:spacing w:after="60"/>
+        <w:rPr>
+          <w:rFonts w:ascii="Segoe UI Emoji" w:hAnsi="Segoe UI Emoji" w:cs="Segoe UI Emoji"/>
+          <w:b/>
+          <w:bCs/>
+        </w:rPr>
+      </w:pPr>
+    </w:p>
+    <w:p>
+      <w:pPr>
+        <w:spacing w:after="60"/>
+        <w:rPr>
+          <w:rFonts w:ascii="Segoe UI Emoji" w:hAnsi="Segoe UI Emoji" w:cs="Segoe UI Emoji"/>
+          <w:b/>
+          <w:bCs/>
+        </w:rPr>
+      </w:pPr>
+    </w:p>
+    <w:p>
+      <w:pPr>
+        <w:spacing w:after="60"/>
+        <w:rPr>
+          <w:b/>
+          <w:bCs/>
+        </w:rPr>
+      </w:pPr>
+      <w:r>
+        <w:rPr>
+          <w:rFonts w:ascii="Segoe UI Emoji" w:hAnsi="Segoe UI Emoji" w:cs="Segoe UI Emoji"/>
+          <w:b/>
+          <w:bCs/>
+        </w:rPr>
+        <w:lastRenderedPageBreak/>
+        <w:t>⭐</w:t>
+      </w:r>
+      <w:r>
+        <w:rPr>
+          <w:b/>
+          <w:bCs/>
+        </w:rPr>
+        <w:t xml:space="preserve"> Remember</w:t>
+      </w:r>
+    </w:p>
+    <w:p>
+      <w:pPr>
+        <w:spacing w:after="60"/>
+      </w:pPr>
+      <w:r>
+        <w:t>% 10       → GET last digit</w:t>
+      </w:r>
+    </w:p>
+    <w:p>
+      <w:pPr>
+        <w:spacing w:after="60"/>
+      </w:pPr>
+      <w:r>
+        <w:t>* 10 + d   → BUILD reverse</w:t>
+      </w:r>
+    </w:p>
+    <w:p>
+      <w:pPr>
+        <w:spacing w:after="60"/>
+      </w:pPr>
+      <w:r>
+        <w:t>// 10      → REMOVE last digit</w:t>
+      </w:r>
+    </w:p>
+    <w:p>
+      <w:pPr>
+        <w:spacing w:after="60"/>
+      </w:pPr>
+      <w:r>
+        <w:t>original == reverse → PALINDROME</w:t>
+      </w:r>
+    </w:p>
+    <w:p>
+      <w:pPr>
+        <w:spacing w:after="60"/>
+      </w:pPr>
+    </w:p>
+    <w:p>
+      <w:pPr>
+        <w:spacing w:after="60"/>
+      </w:pPr>
+    </w:p>
+    <w:p>
+      <w:pPr>
+        <w:spacing w:after="60"/>
+      </w:pPr>
+    </w:p>
+    <w:p>
+      <w:pPr>
+        <w:spacing w:after="60"/>
+      </w:pPr>
+    </w:p>
+    <w:p>
+      <w:pPr>
+        <w:spacing w:after="60"/>
+        <w:rPr>
+          <w:b/>
+          <w:bCs/>
+        </w:rPr>
+      </w:pPr>
+      <w:r>
+        <w:rPr>
+          <w:b/>
+          <w:bCs/>
+          <w:highlight w:val="yellow"/>
+        </w:rPr>
+        <w:t xml:space="preserve">Armstrong </w:t>
+      </w:r>
+      <w:proofErr w:type="gramStart"/>
+      <w:r>
+        <w:rPr>
+          <w:b/>
+          <w:bCs/>
+          <w:highlight w:val="yellow"/>
+        </w:rPr>
+        <w:t>Number</w:t>
+      </w:r>
+      <w:r>
+        <w:rPr>
+          <w:b/>
+          <w:bCs/>
+          <w:highlight w:val="yellow"/>
+        </w:rPr>
+        <w:t>:-</w:t>
+      </w:r>
+      <w:proofErr w:type="gramEnd"/>
+    </w:p>
+    <w:p>
+      <w:pPr>
+        <w:spacing w:after="60"/>
+        <w:rPr>
+          <w:b/>
+          <w:bCs/>
+        </w:rPr>
+      </w:pPr>
+      <w:r>
+        <w:rPr>
+          <w:b/>
+          <w:bCs/>
+        </w:rPr>
+        <w:t>Key Concepts</w:t>
+      </w:r>
+    </w:p>
+    <w:p>
+      <w:pPr>
+        <w:numPr>
+          <w:ilvl w:val="0"/>
+          <w:numId w:val="12"/>
+        </w:numPr>
+        <w:spacing w:after="60"/>
+      </w:pPr>
+      <w:r>
+        <w:rPr>
+          <w:b/>
+          <w:bCs/>
+        </w:rPr>
+        <w:t>Definition:</w:t>
+      </w:r>
+      <w:r>
+        <w:t xml:space="preserve"> An Armstrong Number is a number where the </w:t>
+      </w:r>
+      <w:r>
+        <w:rPr>
+          <w:b/>
+          <w:bCs/>
+        </w:rPr>
+        <w:t>sum of each digit raised to the power of the total number of digits</w:t>
+      </w:r>
+      <w:r>
+        <w:t xml:space="preserve"> equals the original number.</w:t>
+      </w:r>
+    </w:p>
+    <w:p>
+      <w:pPr>
+        <w:numPr>
+          <w:ilvl w:val="0"/>
+          <w:numId w:val="12"/>
+        </w:numPr>
+        <w:spacing w:after="60"/>
+      </w:pPr>
+      <w:r>
+        <w:rPr>
+          <w:b/>
+          <w:bCs/>
+        </w:rPr>
+        <w:t>Example:</w:t>
+      </w:r>
+      <w:r>
+        <w:t xml:space="preserve"> For 153 (3-digit number):</w:t>
+      </w:r>
+    </w:p>
+    <w:p>
+      <w:pPr>
+        <w:spacing w:after="60"/>
+      </w:pPr>
+      <w:r>
+        <w:t>1³ + 5³ + 3³ = 153</w:t>
+      </w:r>
+    </w:p>
+    <w:p>
+      <w:pPr>
+        <w:spacing w:after="60"/>
+      </w:pPr>
+      <w:r>
+        <w:t xml:space="preserve">So, </w:t>
+      </w:r>
+      <w:r>
+        <w:rPr>
+          <w:b/>
+          <w:bCs/>
+        </w:rPr>
+        <w:t>153 is an Armstrong Number</w:t>
+      </w:r>
+      <w:r>
+        <w:t>.</w:t>
+      </w:r>
+    </w:p>
+    <w:p>
+      <w:pPr>
+        <w:spacing w:after="60"/>
+      </w:pPr>
+      <w:r>
+        <w:pict w14:anchorId="59C20501">
+          <v:rect id="_x0000_i1099" style="width:0;height:1.5pt" o:hralign="center" o:hrstd="t" o:hr="t" fillcolor="#a0a0a0" stroked="f"/>
+        </w:pict>
+      </w:r>
+    </w:p>
+    <w:p>
+      <w:pPr>
+        <w:spacing w:after="60"/>
+        <w:rPr>
+          <w:b/>
+          <w:bCs/>
+        </w:rPr>
+      </w:pPr>
+      <w:r>
+        <w:rPr>
+          <w:b/>
+          <w:bCs/>
+        </w:rPr>
+        <w:t>Step-by-Step Logic</w:t>
+      </w:r>
+    </w:p>
+    <w:p>
+      <w:pPr>
+        <w:numPr>
+          <w:ilvl w:val="0"/>
+          <w:numId w:val="13"/>
+        </w:numPr>
+        <w:spacing w:after="60"/>
+      </w:pPr>
+      <w:r>
+        <w:rPr>
+          <w:b/>
+          <w:bCs/>
+        </w:rPr>
+        <w:t>Count the digits:</w:t>
+      </w:r>
+      <w:r>
+        <w:t xml:space="preserve"> Find the total number of digits in the number.</w:t>
+      </w:r>
+    </w:p>
+    <w:p>
+      <w:pPr>
+        <w:numPr>
+          <w:ilvl w:val="0"/>
+          <w:numId w:val="13"/>
+        </w:numPr>
+        <w:spacing w:after="60"/>
+      </w:pPr>
+      <w:r>
+        <w:rPr>
+          <w:b/>
+          <w:bCs/>
+        </w:rPr>
+        <w:t>Extract the last digit:</w:t>
+      </w:r>
+      <w:r>
+        <w:t xml:space="preserve"> Use </w:t>
+      </w:r>
+      <w:proofErr w:type="spellStart"/>
+      <w:r>
+        <w:t>num</w:t>
+      </w:r>
+      <w:proofErr w:type="spellEnd"/>
+      <w:r>
+        <w:t xml:space="preserve"> % 10.</w:t>
+      </w:r>
+    </w:p>
+    <w:p>
+      <w:pPr>
+        <w:numPr>
+          <w:ilvl w:val="0"/>
+          <w:numId w:val="13"/>
+        </w:numPr>
+        <w:spacing w:after="60"/>
+      </w:pPr>
+      <w:r>
+        <w:rPr>
+          <w:b/>
+          <w:bCs/>
+        </w:rPr>
+        <w:t>Calculate the power:</w:t>
+      </w:r>
+      <w:r>
+        <w:t xml:space="preserve"> Raise the digit to the power of the digit count using digit ** count.</w:t>
+      </w:r>
+    </w:p>
+    <w:p>
+      <w:pPr>
+        <w:numPr>
+          <w:ilvl w:val="0"/>
+          <w:numId w:val="13"/>
+        </w:numPr>
+        <w:spacing w:after="60"/>
+      </w:pPr>
+      <w:r>
+        <w:rPr>
+          <w:b/>
+          <w:bCs/>
+        </w:rPr>
+        <w:t>Add to total:</w:t>
+      </w:r>
+      <w:r>
+        <w:t xml:space="preserve"> Add the result to total.</w:t>
+      </w:r>
+    </w:p>
+    <w:p>
+      <w:pPr>
+        <w:numPr>
+          <w:ilvl w:val="0"/>
+          <w:numId w:val="13"/>
+        </w:numPr>
+        <w:spacing w:after="60"/>
+      </w:pPr>
+      <w:r>
+        <w:rPr>
+          <w:b/>
+          <w:bCs/>
+        </w:rPr>
+        <w:t>Remove the last digit:</w:t>
+      </w:r>
+      <w:r>
+        <w:t xml:space="preserve"> Use </w:t>
+      </w:r>
+      <w:proofErr w:type="spellStart"/>
+      <w:r>
+        <w:t>num</w:t>
+      </w:r>
+      <w:proofErr w:type="spellEnd"/>
+      <w:r>
+        <w:t xml:space="preserve"> // 10 and repeat until </w:t>
+      </w:r>
+      <w:proofErr w:type="spellStart"/>
+      <w:r>
+        <w:t>num</w:t>
+      </w:r>
+      <w:proofErr w:type="spellEnd"/>
+      <w:r>
+        <w:t xml:space="preserve"> becomes 0.</w:t>
+      </w:r>
+    </w:p>
+    <w:p>
+      <w:pPr>
+        <w:numPr>
+          <w:ilvl w:val="0"/>
+          <w:numId w:val="13"/>
+        </w:numPr>
+        <w:spacing w:after="60"/>
+      </w:pPr>
+      <w:r>
+        <w:rPr>
+          <w:b/>
+          <w:bCs/>
+        </w:rPr>
+        <w:t>Compare:</w:t>
+      </w:r>
+      <w:r>
+        <w:t xml:space="preserve"> If total == original, the number is an Armstrong Number.</w:t>
+      </w:r>
+    </w:p>
+    <w:p>
+      <w:pPr>
+        <w:spacing w:after="60"/>
+      </w:pPr>
+      <w:r>
+        <w:pict w14:anchorId="0346D81A">
+          <v:rect id="_x0000_i1100" style="width:0;height:1.5pt" o:hralign="center" o:hrstd="t" o:hr="t" fillcolor="#a0a0a0" stroked="f"/>
+        </w:pict>
+      </w:r>
+    </w:p>
+    <w:p>
+      <w:pPr>
+        <w:spacing w:after="60"/>
+        <w:rPr>
+          <w:b/>
+          <w:bCs/>
+        </w:rPr>
+      </w:pPr>
+      <w:r>
+        <w:rPr>
+          <w:b/>
+          <w:bCs/>
+        </w:rPr>
+        <w:t>Python Implementation</w:t>
+      </w:r>
+    </w:p>
+    <w:p>
+      <w:pPr>
+        <w:spacing w:after="60"/>
+      </w:pPr>
+      <w:r>
+        <w:t>n = 153</w:t>
+      </w:r>
+    </w:p>
+    <w:p>
+      <w:pPr>
+        <w:spacing w:after="60"/>
+      </w:pPr>
+      <w:proofErr w:type="spellStart"/>
+      <w:r>
+        <w:t>num</w:t>
+      </w:r>
+      <w:proofErr w:type="spellEnd"/>
+      <w:r>
+        <w:t xml:space="preserve"> = n</w:t>
+      </w:r>
+    </w:p>
+    <w:p>
+      <w:pPr>
+        <w:spacing w:after="60"/>
+      </w:pPr>
+      <w:r>
+        <w:t xml:space="preserve">count = </w:t>
+      </w:r>
+      <w:proofErr w:type="spellStart"/>
+      <w:r>
+        <w:t>len</w:t>
+      </w:r>
+      <w:proofErr w:type="spellEnd"/>
+      <w:r>
+        <w:t>(str(n))</w:t>
+      </w:r>
+    </w:p>
+    <w:p>
+      <w:pPr>
+        <w:spacing w:after="60"/>
+      </w:pPr>
+      <w:r>
+        <w:t>total = 0</w:t>
+      </w:r>
+    </w:p>
+    <w:p>
+      <w:pPr>
+        <w:spacing w:after="60"/>
+      </w:pPr>
+    </w:p>
+    <w:p>
+      <w:pPr>
+        <w:spacing w:after="60"/>
+      </w:pPr>
+      <w:r>
+        <w:t xml:space="preserve">while </w:t>
+      </w:r>
+      <w:proofErr w:type="spellStart"/>
+      <w:r>
+        <w:t>num</w:t>
+      </w:r>
+      <w:proofErr w:type="spellEnd"/>
+      <w:r>
+        <w:t xml:space="preserve"> &gt; 0:</w:t>
+      </w:r>
+    </w:p>
+    <w:p>
+      <w:pPr>
+        <w:spacing w:after="60"/>
+      </w:pPr>
+      <w:r>
+        <w:t xml:space="preserve">    digit = </w:t>
+      </w:r>
+      <w:proofErr w:type="spellStart"/>
+      <w:r>
+        <w:t>num</w:t>
+      </w:r>
+      <w:proofErr w:type="spellEnd"/>
+      <w:r>
+        <w:t xml:space="preserve"> % 10</w:t>
+      </w:r>
+    </w:p>
+    <w:p>
+      <w:pPr>
+        <w:spacing w:after="60"/>
+      </w:pPr>
+      <w:r>
+        <w:t xml:space="preserve">    total += digit ** count</w:t>
+      </w:r>
+    </w:p>
+    <w:p>
+      <w:pPr>
+        <w:spacing w:after="60"/>
+      </w:pPr>
+      <w:r>
+        <w:t xml:space="preserve">    </w:t>
+      </w:r>
+      <w:proofErr w:type="spellStart"/>
+      <w:r>
+        <w:t>num</w:t>
+      </w:r>
+      <w:proofErr w:type="spellEnd"/>
+      <w:r>
+        <w:t xml:space="preserve"> //= 10</w:t>
+      </w:r>
+    </w:p>
+    <w:p>
+      <w:pPr>
+        <w:spacing w:after="60"/>
+      </w:pPr>
+    </w:p>
+    <w:p>
+      <w:pPr>
+        <w:spacing w:after="60"/>
+      </w:pPr>
+      <w:r>
+        <w:t>if total == n:</w:t>
+      </w:r>
+    </w:p>
+    <w:p>
+      <w:pPr>
+        <w:spacing w:after="60"/>
+      </w:pPr>
+      <w:r>
+        <w:t xml:space="preserve">    </w:t>
+      </w:r>
+      <w:proofErr w:type="gramStart"/>
+      <w:r>
+        <w:t>print(</w:t>
+      </w:r>
+      <w:proofErr w:type="gramEnd"/>
+      <w:r>
+        <w:t>"Armstrong Number")</w:t>
+      </w:r>
+    </w:p>
+    <w:p>
+      <w:pPr>
+        <w:spacing w:after="60"/>
+      </w:pPr>
+      <w:r>
+        <w:t>else:</w:t>
+      </w:r>
+    </w:p>
+    <w:p>
+      <w:pPr>
+        <w:spacing w:after="60"/>
+      </w:pPr>
+      <w:r>
+        <w:t xml:space="preserve">    </w:t>
+      </w:r>
+      <w:proofErr w:type="gramStart"/>
+      <w:r>
+        <w:t>print(</w:t>
+      </w:r>
+      <w:proofErr w:type="gramEnd"/>
+      <w:r>
+        <w:t>"Not Armstrong Number")</w:t>
+      </w:r>
+    </w:p>
+    <w:p>
+      <w:pPr>
+        <w:spacing w:after="60"/>
+        <w:rPr>
+          <w:b/>
+          <w:bCs/>
+        </w:rPr>
+      </w:pPr>
+      <w:r>
+        <w:rPr>
+          <w:b/>
+          <w:bCs/>
+        </w:rPr>
+        <w:t>Example: 153</w:t>
+      </w:r>
+    </w:p>
+    <w:p>
+      <w:pPr>
+        <w:spacing w:after="60"/>
+      </w:pPr>
+      <w:r>
+        <w:t>153 → digit 3 → 3³ = 27</w:t>
+      </w:r>
+    </w:p>
+    <w:p>
+      <w:pPr>
+        <w:spacing w:after="60"/>
+      </w:pPr>
+      <w:proofErr w:type="gramStart"/>
+      <w:r>
+        <w:t>15  →</w:t>
+      </w:r>
+      <w:proofErr w:type="gramEnd"/>
+      <w:r>
+        <w:t xml:space="preserve"> digit 5 → 5³ = 125</w:t>
+      </w:r>
+    </w:p>
+    <w:p>
+      <w:pPr>
+        <w:spacing w:after="60"/>
+      </w:pPr>
+      <w:r>
+        <w:t>1   → digit 1 → 1³ = 1</w:t>
+      </w:r>
+    </w:p>
+    <w:p>
+      <w:pPr>
+        <w:spacing w:after="60"/>
+      </w:pPr>
+    </w:p>
+    <w:p>
+      <w:pPr>
+        <w:spacing w:after="60"/>
+      </w:pPr>
+      <w:r>
+        <w:t>total = 27 + 125 + 1</w:t>
+      </w:r>
+    </w:p>
+    <w:p>
+      <w:pPr>
+        <w:spacing w:after="60"/>
+      </w:pPr>
+      <w:r>
+        <w:t xml:space="preserve">      = 153</w:t>
+      </w:r>
+    </w:p>
+    <w:p>
+      <w:pPr>
+        <w:spacing w:after="60"/>
+      </w:pPr>
+      <w:r>
+        <w:t>Original = 153</w:t>
+      </w:r>
+      <w:r>
+        <w:br/>
+        <w:t>Total = 153</w:t>
+      </w:r>
+    </w:p>
+    <w:p>
+      <w:pPr>
+        <w:spacing w:after="60"/>
+      </w:pPr>
+      <w:r>
+        <w:t xml:space="preserve">Therefore, </w:t>
+      </w:r>
+      <w:r>
+        <w:rPr>
+          <w:b/>
+          <w:bCs/>
+        </w:rPr>
+        <w:t>153 is an Armstrong Number</w:t>
+      </w:r>
+      <w:r>
+        <w:t>.</w:t>
+      </w:r>
+    </w:p>
+    <w:p>
+      <w:pPr>
+        <w:spacing w:after="60"/>
+      </w:pPr>
+      <w:r>
+        <w:pict w14:anchorId="4FDCFDAA">
+          <v:rect id="_x0000_i1101" style="width:0;height:1.5pt" o:hralign="center" o:hrstd="t" o:hr="t" fillcolor="#a0a0a0" stroked="f"/>
+        </w:pict>
+      </w:r>
+    </w:p>
+    <w:p>
+      <w:pPr>
+        <w:spacing w:after="60"/>
+        <w:rPr>
+          <w:b/>
+          <w:bCs/>
+        </w:rPr>
+      </w:pPr>
+      <w:r>
+        <w:rPr>
+          <w:b/>
+          <w:bCs/>
+        </w:rPr>
+        <w:t>Complexity Analysis</w:t>
+      </w:r>
+    </w:p>
+    <w:p>
+      <w:pPr>
+        <w:spacing w:after="60"/>
+      </w:pPr>
+      <w:r>
+        <w:t>If the number has d digits:</w:t>
+      </w:r>
+    </w:p>
+    <w:p>
+      <w:pPr>
+        <w:spacing w:after="60"/>
+      </w:pPr>
+      <w:r>
+        <w:rPr>
+          <w:b/>
+          <w:bCs/>
+        </w:rPr>
+        <w:t>Time Complexity:</w:t>
+      </w:r>
+      <w:r>
+        <w:t xml:space="preserve"> O(d)</w:t>
+      </w:r>
+      <w:r>
+        <w:br/>
+      </w:r>
+      <w:r>
+        <w:rPr>
+          <w:b/>
+          <w:bCs/>
+        </w:rPr>
+        <w:t>Space Complexity:</w:t>
+      </w:r>
+      <w:r>
+        <w:t xml:space="preserve"> </w:t>
+      </w:r>
+      <w:proofErr w:type="gramStart"/>
+      <w:r>
+        <w:t>O(</w:t>
+      </w:r>
+      <w:proofErr w:type="gramEnd"/>
+      <w:r>
+        <w:t>1)</w:t>
+      </w:r>
+    </w:p>
+    <w:p>
+      <w:pPr>
+        <w:spacing w:after="60"/>
+      </w:pPr>
+      <w:r>
+        <w:pict w14:anchorId="6BFC40A5">
+          <v:rect id="_x0000_i1102" style="width:0;height:1.5pt" o:hralign="center" o:hrstd="t" o:hr="t" fillcolor="#a0a0a0" stroked="f"/>
+        </w:pict>
+      </w:r>
+    </w:p>
+    <w:p>
+      <w:pPr>
+        <w:spacing w:after="60"/>
+        <w:rPr>
+          <w:b/>
+          <w:bCs/>
+        </w:rPr>
+      </w:pPr>
+      <w:r>
+        <w:rPr>
+          <w:rFonts w:ascii="Segoe UI Emoji" w:hAnsi="Segoe UI Emoji" w:cs="Segoe UI Emoji"/>
+          <w:b/>
+          <w:bCs/>
+        </w:rPr>
+        <w:t>⭐</w:t>
+      </w:r>
+      <w:r>
+        <w:rPr>
+          <w:b/>
+          <w:bCs/>
+        </w:rPr>
+        <w:t xml:space="preserve"> Remember</w:t>
+      </w:r>
+    </w:p>
+    <w:p>
+      <w:pPr>
+        <w:spacing w:after="60"/>
+      </w:pPr>
+      <w:r>
+        <w:t>Count digits → power</w:t>
+      </w:r>
+    </w:p>
+    <w:p>
+      <w:pPr>
+        <w:spacing w:after="60"/>
+      </w:pPr>
+      <w:r>
+        <w:t>% 10         → GET digit</w:t>
+      </w:r>
+    </w:p>
+    <w:p>
+      <w:pPr>
+        <w:spacing w:after="60"/>
+      </w:pPr>
+      <w:r>
+        <w:t>** count     → RAISE digit</w:t>
+      </w:r>
+    </w:p>
+    <w:p>
+      <w:pPr>
+        <w:spacing w:after="60"/>
+      </w:pPr>
+      <w:r>
+        <w:t>// 10        → REMOVE digit</w:t>
+      </w:r>
+    </w:p>
+    <w:p>
+      <w:pPr>
+        <w:spacing w:after="60"/>
+      </w:pPr>
+      <w:r>
+        <w:t>total == original → ARMSTRONG</w:t>
+      </w:r>
     </w:p>
     <w:p>
       <w:pPr>
@@ -4772,6 +6524,119 @@
     </w:lvl>
   </w:abstractNum>
   <w:abstractNum w:abstractNumId="1" w15:restartNumberingAfterBreak="0">
+    <w:nsid w:val="174570F7"/>
+    <w:multiLevelType w:val="multilevel"/>
+    <w:tmpl w:val="F68E473A"/>
+    <w:lvl w:ilvl="0">
+      <w:start w:val="1"/>
+      <w:numFmt w:val="decimal"/>
+      <w:lvlText w:val="%1."/>
+      <w:lvlJc w:val="left"/>
+      <w:pPr>
+        <w:tabs>
+          <w:tab w:val="num" w:pos="720"/>
+        </w:tabs>
+        <w:ind w:left="720" w:hanging="360"/>
+      </w:pPr>
+    </w:lvl>
+    <w:lvl w:ilvl="1" w:tentative="1">
+      <w:start w:val="1"/>
+      <w:numFmt w:val="decimal"/>
+      <w:lvlText w:val="%2."/>
+      <w:lvlJc w:val="left"/>
+      <w:pPr>
+        <w:tabs>
+          <w:tab w:val="num" w:pos="1440"/>
+        </w:tabs>
+        <w:ind w:left="1440" w:hanging="360"/>
+      </w:pPr>
+    </w:lvl>
+    <w:lvl w:ilvl="2" w:tentative="1">
+      <w:start w:val="1"/>
+      <w:numFmt w:val="decimal"/>
+      <w:lvlText w:val="%3."/>
+      <w:lvlJc w:val="left"/>
+      <w:pPr>
+        <w:tabs>
+          <w:tab w:val="num" w:pos="2160"/>
+        </w:tabs>
+        <w:ind w:left="2160" w:hanging="360"/>
+      </w:pPr>
+    </w:lvl>
+    <w:lvl w:ilvl="3" w:tentative="1">
+      <w:start w:val="1"/>
+      <w:numFmt w:val="decimal"/>
+      <w:lvlText w:val="%4."/>
+      <w:lvlJc w:val="left"/>
+      <w:pPr>
+        <w:tabs>
+          <w:tab w:val="num" w:pos="2880"/>
+        </w:tabs>
+        <w:ind w:left="2880" w:hanging="360"/>
+      </w:pPr>
+    </w:lvl>
+    <w:lvl w:ilvl="4" w:tentative="1">
+      <w:start w:val="1"/>
+      <w:numFmt w:val="decimal"/>
+      <w:lvlText w:val="%5."/>
+      <w:lvlJc w:val="left"/>
+      <w:pPr>
+        <w:tabs>
+          <w:tab w:val="num" w:pos="3600"/>
+        </w:tabs>
+        <w:ind w:left="3600" w:hanging="360"/>
+      </w:pPr>
+    </w:lvl>
+    <w:lvl w:ilvl="5" w:tentative="1">
+      <w:start w:val="1"/>
+      <w:numFmt w:val="decimal"/>
+      <w:lvlText w:val="%6."/>
+      <w:lvlJc w:val="left"/>
+      <w:pPr>
+        <w:tabs>
+          <w:tab w:val="num" w:pos="4320"/>
+        </w:tabs>
+        <w:ind w:left="4320" w:hanging="360"/>
+      </w:pPr>
+    </w:lvl>
+    <w:lvl w:ilvl="6" w:tentative="1">
+      <w:start w:val="1"/>
+      <w:numFmt w:val="decimal"/>
+      <w:lvlText w:val="%7."/>
+      <w:lvlJc w:val="left"/>
+      <w:pPr>
+        <w:tabs>
+          <w:tab w:val="num" w:pos="5040"/>
+        </w:tabs>
+        <w:ind w:left="5040" w:hanging="360"/>
+      </w:pPr>
+    </w:lvl>
+    <w:lvl w:ilvl="7" w:tentative="1">
+      <w:start w:val="1"/>
+      <w:numFmt w:val="decimal"/>
+      <w:lvlText w:val="%8."/>
+      <w:lvlJc w:val="left"/>
+      <w:pPr>
+        <w:tabs>
+          <w:tab w:val="num" w:pos="5760"/>
+        </w:tabs>
+        <w:ind w:left="5760" w:hanging="360"/>
+      </w:pPr>
+    </w:lvl>
+    <w:lvl w:ilvl="8" w:tentative="1">
+      <w:start w:val="1"/>
+      <w:numFmt w:val="decimal"/>
+      <w:lvlText w:val="%9."/>
+      <w:lvlJc w:val="left"/>
+      <w:pPr>
+        <w:tabs>
+          <w:tab w:val="num" w:pos="6480"/>
+        </w:tabs>
+        <w:ind w:left="6480" w:hanging="360"/>
+      </w:pPr>
+    </w:lvl>
+  </w:abstractNum>
+  <w:abstractNum w:abstractNumId="2" w15:restartNumberingAfterBreak="0">
     <w:nsid w:val="1AFE49FF"/>
     <w:multiLevelType w:val="multilevel"/>
     <w:tmpl w:val="2482E7E0"/>
@@ -4920,7 +6785,7 @@
       </w:rPr>
     </w:lvl>
   </w:abstractNum>
-  <w:abstractNum w:abstractNumId="2" w15:restartNumberingAfterBreak="0">
+  <w:abstractNum w:abstractNumId="3" w15:restartNumberingAfterBreak="0">
     <w:nsid w:val="20AB0357"/>
     <w:multiLevelType w:val="multilevel"/>
     <w:tmpl w:val="C526B858"/>
@@ -5069,7 +6934,7 @@
       </w:rPr>
     </w:lvl>
   </w:abstractNum>
-  <w:abstractNum w:abstractNumId="3" w15:restartNumberingAfterBreak="0">
+  <w:abstractNum w:abstractNumId="4" w15:restartNumberingAfterBreak="0">
     <w:nsid w:val="2F0F14B2"/>
     <w:multiLevelType w:val="multilevel"/>
     <w:tmpl w:val="62946078"/>
@@ -5218,7 +7083,269 @@
       </w:rPr>
     </w:lvl>
   </w:abstractNum>
-  <w:abstractNum w:abstractNumId="4" w15:restartNumberingAfterBreak="0">
+  <w:abstractNum w:abstractNumId="5" w15:restartNumberingAfterBreak="0">
+    <w:nsid w:val="2F4514E0"/>
+    <w:multiLevelType w:val="multilevel"/>
+    <w:tmpl w:val="2E7A6A3C"/>
+    <w:lvl w:ilvl="0">
+      <w:start w:val="1"/>
+      <w:numFmt w:val="bullet"/>
+      <w:lvlText w:val=""/>
+      <w:lvlJc w:val="left"/>
+      <w:pPr>
+        <w:tabs>
+          <w:tab w:val="num" w:pos="720"/>
+        </w:tabs>
+        <w:ind w:left="720" w:hanging="360"/>
+      </w:pPr>
+      <w:rPr>
+        <w:rFonts w:ascii="Symbol" w:hAnsi="Symbol" w:hint="default"/>
+        <w:sz w:val="20"/>
+      </w:rPr>
+    </w:lvl>
+    <w:lvl w:ilvl="1" w:tentative="1">
+      <w:start w:val="1"/>
+      <w:numFmt w:val="bullet"/>
+      <w:lvlText w:val="o"/>
+      <w:lvlJc w:val="left"/>
+      <w:pPr>
+        <w:tabs>
+          <w:tab w:val="num" w:pos="1440"/>
+        </w:tabs>
+        <w:ind w:left="1440" w:hanging="360"/>
+      </w:pPr>
+      <w:rPr>
+        <w:rFonts w:ascii="Courier New" w:hAnsi="Courier New" w:hint="default"/>
+        <w:sz w:val="20"/>
+      </w:rPr>
+    </w:lvl>
+    <w:lvl w:ilvl="2" w:tentative="1">
+      <w:start w:val="1"/>
+      <w:numFmt w:val="bullet"/>
+      <w:lvlText w:val=""/>
+      <w:lvlJc w:val="left"/>
+      <w:pPr>
+        <w:tabs>
+          <w:tab w:val="num" w:pos="2160"/>
+        </w:tabs>
+        <w:ind w:left="2160" w:hanging="360"/>
+      </w:pPr>
+      <w:rPr>
+        <w:rFonts w:ascii="Wingdings" w:hAnsi="Wingdings" w:hint="default"/>
+        <w:sz w:val="20"/>
+      </w:rPr>
+    </w:lvl>
+    <w:lvl w:ilvl="3" w:tentative="1">
+      <w:start w:val="1"/>
+      <w:numFmt w:val="bullet"/>
+      <w:lvlText w:val=""/>
+      <w:lvlJc w:val="left"/>
+      <w:pPr>
+        <w:tabs>
+          <w:tab w:val="num" w:pos="2880"/>
+        </w:tabs>
+        <w:ind w:left="2880" w:hanging="360"/>
+      </w:pPr>
+      <w:rPr>
+        <w:rFonts w:ascii="Wingdings" w:hAnsi="Wingdings" w:hint="default"/>
+        <w:sz w:val="20"/>
+      </w:rPr>
+    </w:lvl>
+    <w:lvl w:ilvl="4" w:tentative="1">
+      <w:start w:val="1"/>
+      <w:numFmt w:val="bullet"/>
+      <w:lvlText w:val=""/>
+      <w:lvlJc w:val="left"/>
+      <w:pPr>
+        <w:tabs>
+          <w:tab w:val="num" w:pos="3600"/>
+        </w:tabs>
+        <w:ind w:left="3600" w:hanging="360"/>
+      </w:pPr>
+      <w:rPr>
+        <w:rFonts w:ascii="Wingdings" w:hAnsi="Wingdings" w:hint="default"/>
+        <w:sz w:val="20"/>
+      </w:rPr>
+    </w:lvl>
+    <w:lvl w:ilvl="5" w:tentative="1">
+      <w:start w:val="1"/>
+      <w:numFmt w:val="bullet"/>
+      <w:lvlText w:val=""/>
+      <w:lvlJc w:val="left"/>
+      <w:pPr>
+        <w:tabs>
+          <w:tab w:val="num" w:pos="4320"/>
+        </w:tabs>
+        <w:ind w:left="4320" w:hanging="360"/>
+      </w:pPr>
+      <w:rPr>
+        <w:rFonts w:ascii="Wingdings" w:hAnsi="Wingdings" w:hint="default"/>
+        <w:sz w:val="20"/>
+      </w:rPr>
+    </w:lvl>
+    <w:lvl w:ilvl="6" w:tentative="1">
+      <w:start w:val="1"/>
+      <w:numFmt w:val="bullet"/>
+      <w:lvlText w:val=""/>
+      <w:lvlJc w:val="left"/>
+      <w:pPr>
+        <w:tabs>
+          <w:tab w:val="num" w:pos="5040"/>
+        </w:tabs>
+        <w:ind w:left="5040" w:hanging="360"/>
+      </w:pPr>
+      <w:rPr>
+        <w:rFonts w:ascii="Wingdings" w:hAnsi="Wingdings" w:hint="default"/>
+        <w:sz w:val="20"/>
+      </w:rPr>
+    </w:lvl>
+    <w:lvl w:ilvl="7" w:tentative="1">
+      <w:start w:val="1"/>
+      <w:numFmt w:val="bullet"/>
+      <w:lvlText w:val=""/>
+      <w:lvlJc w:val="left"/>
+      <w:pPr>
+        <w:tabs>
+          <w:tab w:val="num" w:pos="5760"/>
+        </w:tabs>
+        <w:ind w:left="5760" w:hanging="360"/>
+      </w:pPr>
+      <w:rPr>
+        <w:rFonts w:ascii="Wingdings" w:hAnsi="Wingdings" w:hint="default"/>
+        <w:sz w:val="20"/>
+      </w:rPr>
+    </w:lvl>
+    <w:lvl w:ilvl="8" w:tentative="1">
+      <w:start w:val="1"/>
+      <w:numFmt w:val="bullet"/>
+      <w:lvlText w:val=""/>
+      <w:lvlJc w:val="left"/>
+      <w:pPr>
+        <w:tabs>
+          <w:tab w:val="num" w:pos="6480"/>
+        </w:tabs>
+        <w:ind w:left="6480" w:hanging="360"/>
+      </w:pPr>
+      <w:rPr>
+        <w:rFonts w:ascii="Wingdings" w:hAnsi="Wingdings" w:hint="default"/>
+        <w:sz w:val="20"/>
+      </w:rPr>
+    </w:lvl>
+  </w:abstractNum>
+  <w:abstractNum w:abstractNumId="6" w15:restartNumberingAfterBreak="0">
+    <w:nsid w:val="34B828ED"/>
+    <w:multiLevelType w:val="multilevel"/>
+    <w:tmpl w:val="8D543D5A"/>
+    <w:lvl w:ilvl="0">
+      <w:start w:val="1"/>
+      <w:numFmt w:val="decimal"/>
+      <w:lvlText w:val="%1."/>
+      <w:lvlJc w:val="left"/>
+      <w:pPr>
+        <w:tabs>
+          <w:tab w:val="num" w:pos="720"/>
+        </w:tabs>
+        <w:ind w:left="720" w:hanging="360"/>
+      </w:pPr>
+    </w:lvl>
+    <w:lvl w:ilvl="1" w:tentative="1">
+      <w:start w:val="1"/>
+      <w:numFmt w:val="decimal"/>
+      <w:lvlText w:val="%2."/>
+      <w:lvlJc w:val="left"/>
+      <w:pPr>
+        <w:tabs>
+          <w:tab w:val="num" w:pos="1440"/>
+        </w:tabs>
+        <w:ind w:left="1440" w:hanging="360"/>
+      </w:pPr>
+    </w:lvl>
+    <w:lvl w:ilvl="2" w:tentative="1">
+      <w:start w:val="1"/>
+      <w:numFmt w:val="decimal"/>
+      <w:lvlText w:val="%3."/>
+      <w:lvlJc w:val="left"/>
+      <w:pPr>
+        <w:tabs>
+          <w:tab w:val="num" w:pos="2160"/>
+        </w:tabs>
+        <w:ind w:left="2160" w:hanging="360"/>
+      </w:pPr>
+    </w:lvl>
+    <w:lvl w:ilvl="3" w:tentative="1">
+      <w:start w:val="1"/>
+      <w:numFmt w:val="decimal"/>
+      <w:lvlText w:val="%4."/>
+      <w:lvlJc w:val="left"/>
+      <w:pPr>
+        <w:tabs>
+          <w:tab w:val="num" w:pos="2880"/>
+        </w:tabs>
+        <w:ind w:left="2880" w:hanging="360"/>
+      </w:pPr>
+    </w:lvl>
+    <w:lvl w:ilvl="4" w:tentative="1">
+      <w:start w:val="1"/>
+      <w:numFmt w:val="decimal"/>
+      <w:lvlText w:val="%5."/>
+      <w:lvlJc w:val="left"/>
+      <w:pPr>
+        <w:tabs>
+          <w:tab w:val="num" w:pos="3600"/>
+        </w:tabs>
+        <w:ind w:left="3600" w:hanging="360"/>
+      </w:pPr>
+    </w:lvl>
+    <w:lvl w:ilvl="5" w:tentative="1">
+      <w:start w:val="1"/>
+      <w:numFmt w:val="decimal"/>
+      <w:lvlText w:val="%6."/>
+      <w:lvlJc w:val="left"/>
+      <w:pPr>
+        <w:tabs>
+          <w:tab w:val="num" w:pos="4320"/>
+        </w:tabs>
+        <w:ind w:left="4320" w:hanging="360"/>
+      </w:pPr>
+    </w:lvl>
+    <w:lvl w:ilvl="6" w:tentative="1">
+      <w:start w:val="1"/>
+      <w:numFmt w:val="decimal"/>
+      <w:lvlText w:val="%7."/>
+      <w:lvlJc w:val="left"/>
+      <w:pPr>
+        <w:tabs>
+          <w:tab w:val="num" w:pos="5040"/>
+        </w:tabs>
+        <w:ind w:left="5040" w:hanging="360"/>
+      </w:pPr>
+    </w:lvl>
+    <w:lvl w:ilvl="7" w:tentative="1">
+      <w:start w:val="1"/>
+      <w:numFmt w:val="decimal"/>
+      <w:lvlText w:val="%8."/>
+      <w:lvlJc w:val="left"/>
+      <w:pPr>
+        <w:tabs>
+          <w:tab w:val="num" w:pos="5760"/>
+        </w:tabs>
+        <w:ind w:left="5760" w:hanging="360"/>
+      </w:pPr>
+    </w:lvl>
+    <w:lvl w:ilvl="8" w:tentative="1">
+      <w:start w:val="1"/>
+      <w:numFmt w:val="decimal"/>
+      <w:lvlText w:val="%9."/>
+      <w:lvlJc w:val="left"/>
+      <w:pPr>
+        <w:tabs>
+          <w:tab w:val="num" w:pos="6480"/>
+        </w:tabs>
+        <w:ind w:left="6480" w:hanging="360"/>
+      </w:pPr>
+    </w:lvl>
+  </w:abstractNum>
+  <w:abstractNum w:abstractNumId="7" w15:restartNumberingAfterBreak="0">
     <w:nsid w:val="353610AD"/>
     <w:multiLevelType w:val="hybridMultilevel"/>
     <w:tmpl w:val="F2400432"/>
@@ -5269,7 +7396,156 @@
       <w:lvlJc w:val="left"/>
     </w:lvl>
   </w:abstractNum>
-  <w:abstractNum w:abstractNumId="5" w15:restartNumberingAfterBreak="0">
+  <w:abstractNum w:abstractNumId="8" w15:restartNumberingAfterBreak="0">
+    <w:nsid w:val="39040ACD"/>
+    <w:multiLevelType w:val="multilevel"/>
+    <w:tmpl w:val="29365C8A"/>
+    <w:lvl w:ilvl="0">
+      <w:start w:val="1"/>
+      <w:numFmt w:val="bullet"/>
+      <w:lvlText w:val=""/>
+      <w:lvlJc w:val="left"/>
+      <w:pPr>
+        <w:tabs>
+          <w:tab w:val="num" w:pos="720"/>
+        </w:tabs>
+        <w:ind w:left="720" w:hanging="360"/>
+      </w:pPr>
+      <w:rPr>
+        <w:rFonts w:ascii="Symbol" w:hAnsi="Symbol" w:hint="default"/>
+        <w:sz w:val="20"/>
+      </w:rPr>
+    </w:lvl>
+    <w:lvl w:ilvl="1" w:tentative="1">
+      <w:start w:val="1"/>
+      <w:numFmt w:val="bullet"/>
+      <w:lvlText w:val="o"/>
+      <w:lvlJc w:val="left"/>
+      <w:pPr>
+        <w:tabs>
+          <w:tab w:val="num" w:pos="1440"/>
+        </w:tabs>
+        <w:ind w:left="1440" w:hanging="360"/>
+      </w:pPr>
+      <w:rPr>
+        <w:rFonts w:ascii="Courier New" w:hAnsi="Courier New" w:hint="default"/>
+        <w:sz w:val="20"/>
+      </w:rPr>
+    </w:lvl>
+    <w:lvl w:ilvl="2" w:tentative="1">
+      <w:start w:val="1"/>
+      <w:numFmt w:val="bullet"/>
+      <w:lvlText w:val=""/>
+      <w:lvlJc w:val="left"/>
+      <w:pPr>
+        <w:tabs>
+          <w:tab w:val="num" w:pos="2160"/>
+        </w:tabs>
+        <w:ind w:left="2160" w:hanging="360"/>
+      </w:pPr>
+      <w:rPr>
+        <w:rFonts w:ascii="Wingdings" w:hAnsi="Wingdings" w:hint="default"/>
+        <w:sz w:val="20"/>
+      </w:rPr>
+    </w:lvl>
+    <w:lvl w:ilvl="3" w:tentative="1">
+      <w:start w:val="1"/>
+      <w:numFmt w:val="bullet"/>
+      <w:lvlText w:val=""/>
+      <w:lvlJc w:val="left"/>
+      <w:pPr>
+        <w:tabs>
+          <w:tab w:val="num" w:pos="2880"/>
+        </w:tabs>
+        <w:ind w:left="2880" w:hanging="360"/>
+      </w:pPr>
+      <w:rPr>
+        <w:rFonts w:ascii="Wingdings" w:hAnsi="Wingdings" w:hint="default"/>
+        <w:sz w:val="20"/>
+      </w:rPr>
+    </w:lvl>
+    <w:lvl w:ilvl="4" w:tentative="1">
+      <w:start w:val="1"/>
+      <w:numFmt w:val="bullet"/>
+      <w:lvlText w:val=""/>
+      <w:lvlJc w:val="left"/>
+      <w:pPr>
+        <w:tabs>
+          <w:tab w:val="num" w:pos="3600"/>
+        </w:tabs>
+        <w:ind w:left="3600" w:hanging="360"/>
+      </w:pPr>
+      <w:rPr>
+        <w:rFonts w:ascii="Wingdings" w:hAnsi="Wingdings" w:hint="default"/>
+        <w:sz w:val="20"/>
+      </w:rPr>
+    </w:lvl>
+    <w:lvl w:ilvl="5" w:tentative="1">
+      <w:start w:val="1"/>
+      <w:numFmt w:val="bullet"/>
+      <w:lvlText w:val=""/>
+      <w:lvlJc w:val="left"/>
+      <w:pPr>
+        <w:tabs>
+          <w:tab w:val="num" w:pos="4320"/>
+        </w:tabs>
+        <w:ind w:left="4320" w:hanging="360"/>
+      </w:pPr>
+      <w:rPr>
+        <w:rFonts w:ascii="Wingdings" w:hAnsi="Wingdings" w:hint="default"/>
+        <w:sz w:val="20"/>
+      </w:rPr>
+    </w:lvl>
+    <w:lvl w:ilvl="6" w:tentative="1">
+      <w:start w:val="1"/>
+      <w:numFmt w:val="bullet"/>
+      <w:lvlText w:val=""/>
+      <w:lvlJc w:val="left"/>
+      <w:pPr>
+        <w:tabs>
+          <w:tab w:val="num" w:pos="5040"/>
+        </w:tabs>
+        <w:ind w:left="5040" w:hanging="360"/>
+      </w:pPr>
+      <w:rPr>
+        <w:rFonts w:ascii="Wingdings" w:hAnsi="Wingdings" w:hint="default"/>
+        <w:sz w:val="20"/>
+      </w:rPr>
+    </w:lvl>
+    <w:lvl w:ilvl="7" w:tentative="1">
+      <w:start w:val="1"/>
+      <w:numFmt w:val="bullet"/>
+      <w:lvlText w:val=""/>
+      <w:lvlJc w:val="left"/>
+      <w:pPr>
+        <w:tabs>
+          <w:tab w:val="num" w:pos="5760"/>
+        </w:tabs>
+        <w:ind w:left="5760" w:hanging="360"/>
+      </w:pPr>
+      <w:rPr>
+        <w:rFonts w:ascii="Wingdings" w:hAnsi="Wingdings" w:hint="default"/>
+        <w:sz w:val="20"/>
+      </w:rPr>
+    </w:lvl>
+    <w:lvl w:ilvl="8" w:tentative="1">
+      <w:start w:val="1"/>
+      <w:numFmt w:val="bullet"/>
+      <w:lvlText w:val=""/>
+      <w:lvlJc w:val="left"/>
+      <w:pPr>
+        <w:tabs>
+          <w:tab w:val="num" w:pos="6480"/>
+        </w:tabs>
+        <w:ind w:left="6480" w:hanging="360"/>
+      </w:pPr>
+      <w:rPr>
+        <w:rFonts w:ascii="Wingdings" w:hAnsi="Wingdings" w:hint="default"/>
+        <w:sz w:val="20"/>
+      </w:rPr>
+    </w:lvl>
+  </w:abstractNum>
+  <w:abstractNum w:abstractNumId="9" w15:restartNumberingAfterBreak="0">
     <w:nsid w:val="4AAD03CE"/>
     <w:multiLevelType w:val="multilevel"/>
     <w:tmpl w:val="652A6F6A"/>
@@ -5382,7 +7658,156 @@
       </w:pPr>
     </w:lvl>
   </w:abstractNum>
-  <w:abstractNum w:abstractNumId="6" w15:restartNumberingAfterBreak="0">
+  <w:abstractNum w:abstractNumId="10" w15:restartNumberingAfterBreak="0">
+    <w:nsid w:val="626C051F"/>
+    <w:multiLevelType w:val="multilevel"/>
+    <w:tmpl w:val="6F8E3D48"/>
+    <w:lvl w:ilvl="0">
+      <w:start w:val="1"/>
+      <w:numFmt w:val="bullet"/>
+      <w:lvlText w:val=""/>
+      <w:lvlJc w:val="left"/>
+      <w:pPr>
+        <w:tabs>
+          <w:tab w:val="num" w:pos="720"/>
+        </w:tabs>
+        <w:ind w:left="720" w:hanging="360"/>
+      </w:pPr>
+      <w:rPr>
+        <w:rFonts w:ascii="Symbol" w:hAnsi="Symbol" w:hint="default"/>
+        <w:sz w:val="20"/>
+      </w:rPr>
+    </w:lvl>
+    <w:lvl w:ilvl="1" w:tentative="1">
+      <w:start w:val="1"/>
+      <w:numFmt w:val="bullet"/>
+      <w:lvlText w:val="o"/>
+      <w:lvlJc w:val="left"/>
+      <w:pPr>
+        <w:tabs>
+          <w:tab w:val="num" w:pos="1440"/>
+        </w:tabs>
+        <w:ind w:left="1440" w:hanging="360"/>
+      </w:pPr>
+      <w:rPr>
+        <w:rFonts w:ascii="Courier New" w:hAnsi="Courier New" w:hint="default"/>
+        <w:sz w:val="20"/>
+      </w:rPr>
+    </w:lvl>
+    <w:lvl w:ilvl="2" w:tentative="1">
+      <w:start w:val="1"/>
+      <w:numFmt w:val="bullet"/>
+      <w:lvlText w:val=""/>
+      <w:lvlJc w:val="left"/>
+      <w:pPr>
+        <w:tabs>
+          <w:tab w:val="num" w:pos="2160"/>
+        </w:tabs>
+        <w:ind w:left="2160" w:hanging="360"/>
+      </w:pPr>
+      <w:rPr>
+        <w:rFonts w:ascii="Wingdings" w:hAnsi="Wingdings" w:hint="default"/>
+        <w:sz w:val="20"/>
+      </w:rPr>
+    </w:lvl>
+    <w:lvl w:ilvl="3" w:tentative="1">
+      <w:start w:val="1"/>
+      <w:numFmt w:val="bullet"/>
+      <w:lvlText w:val=""/>
+      <w:lvlJc w:val="left"/>
+      <w:pPr>
+        <w:tabs>
+          <w:tab w:val="num" w:pos="2880"/>
+        </w:tabs>
+        <w:ind w:left="2880" w:hanging="360"/>
+      </w:pPr>
+      <w:rPr>
+        <w:rFonts w:ascii="Wingdings" w:hAnsi="Wingdings" w:hint="default"/>
+        <w:sz w:val="20"/>
+      </w:rPr>
+    </w:lvl>
+    <w:lvl w:ilvl="4" w:tentative="1">
+      <w:start w:val="1"/>
+      <w:numFmt w:val="bullet"/>
+      <w:lvlText w:val=""/>
+      <w:lvlJc w:val="left"/>
+      <w:pPr>
+        <w:tabs>
+          <w:tab w:val="num" w:pos="3600"/>
+        </w:tabs>
+        <w:ind w:left="3600" w:hanging="360"/>
+      </w:pPr>
+      <w:rPr>
+        <w:rFonts w:ascii="Wingdings" w:hAnsi="Wingdings" w:hint="default"/>
+        <w:sz w:val="20"/>
+      </w:rPr>
+    </w:lvl>
+    <w:lvl w:ilvl="5" w:tentative="1">
+      <w:start w:val="1"/>
+      <w:numFmt w:val="bullet"/>
+      <w:lvlText w:val=""/>
+      <w:lvlJc w:val="left"/>
+      <w:pPr>
+        <w:tabs>
+          <w:tab w:val="num" w:pos="4320"/>
+        </w:tabs>
+        <w:ind w:left="4320" w:hanging="360"/>
+      </w:pPr>
+      <w:rPr>
+        <w:rFonts w:ascii="Wingdings" w:hAnsi="Wingdings" w:hint="default"/>
+        <w:sz w:val="20"/>
+      </w:rPr>
+    </w:lvl>
+    <w:lvl w:ilvl="6" w:tentative="1">
+      <w:start w:val="1"/>
+      <w:numFmt w:val="bullet"/>
+      <w:lvlText w:val=""/>
+      <w:lvlJc w:val="left"/>
+      <w:pPr>
+        <w:tabs>
+          <w:tab w:val="num" w:pos="5040"/>
+        </w:tabs>
+        <w:ind w:left="5040" w:hanging="360"/>
+      </w:pPr>
+      <w:rPr>
+        <w:rFonts w:ascii="Wingdings" w:hAnsi="Wingdings" w:hint="default"/>
+        <w:sz w:val="20"/>
+      </w:rPr>
+    </w:lvl>
+    <w:lvl w:ilvl="7" w:tentative="1">
+      <w:start w:val="1"/>
+      <w:numFmt w:val="bullet"/>
+      <w:lvlText w:val=""/>
+      <w:lvlJc w:val="left"/>
+      <w:pPr>
+        <w:tabs>
+          <w:tab w:val="num" w:pos="5760"/>
+        </w:tabs>
+        <w:ind w:left="5760" w:hanging="360"/>
+      </w:pPr>
+      <w:rPr>
+        <w:rFonts w:ascii="Wingdings" w:hAnsi="Wingdings" w:hint="default"/>
+        <w:sz w:val="20"/>
+      </w:rPr>
+    </w:lvl>
+    <w:lvl w:ilvl="8" w:tentative="1">
+      <w:start w:val="1"/>
+      <w:numFmt w:val="bullet"/>
+      <w:lvlText w:val=""/>
+      <w:lvlJc w:val="left"/>
+      <w:pPr>
+        <w:tabs>
+          <w:tab w:val="num" w:pos="6480"/>
+        </w:tabs>
+        <w:ind w:left="6480" w:hanging="360"/>
+      </w:pPr>
+      <w:rPr>
+        <w:rFonts w:ascii="Wingdings" w:hAnsi="Wingdings" w:hint="default"/>
+        <w:sz w:val="20"/>
+      </w:rPr>
+    </w:lvl>
+  </w:abstractNum>
+  <w:abstractNum w:abstractNumId="11" w15:restartNumberingAfterBreak="0">
     <w:nsid w:val="68804AC4"/>
     <w:multiLevelType w:val="multilevel"/>
     <w:tmpl w:val="23BEA346"/>
@@ -5495,7 +7920,7 @@
       </w:pPr>
     </w:lvl>
   </w:abstractNum>
-  <w:abstractNum w:abstractNumId="7" w15:restartNumberingAfterBreak="0">
+  <w:abstractNum w:abstractNumId="12" w15:restartNumberingAfterBreak="0">
     <w:nsid w:val="6C4F6565"/>
     <w:multiLevelType w:val="hybridMultilevel"/>
     <w:tmpl w:val="50289C5E"/>
@@ -5582,34 +8007,49 @@
     </w:lvl>
   </w:abstractNum>
   <w:num w:numId="1" w16cid:durableId="1783449798">
+    <w:abstractNumId w:val="12"/>
+    <w:lvlOverride w:ilvl="0">
+      <w:startOverride w:val="1"/>
+    </w:lvlOverride>
+  </w:num>
+  <w:num w:numId="2" w16cid:durableId="1096562278">
     <w:abstractNumId w:val="7"/>
     <w:lvlOverride w:ilvl="0">
       <w:startOverride w:val="1"/>
     </w:lvlOverride>
   </w:num>
-  <w:num w:numId="2" w16cid:durableId="1096562278">
-    <w:abstractNumId w:val="4"/>
-    <w:lvlOverride w:ilvl="0">
-      <w:startOverride w:val="1"/>
-    </w:lvlOverride>
-  </w:num>
   <w:num w:numId="3" w16cid:durableId="481047305">
-    <w:abstractNumId w:val="1"/>
+    <w:abstractNumId w:val="2"/>
   </w:num>
   <w:num w:numId="4" w16cid:durableId="1500316488">
-    <w:abstractNumId w:val="5"/>
+    <w:abstractNumId w:val="9"/>
   </w:num>
   <w:num w:numId="5" w16cid:durableId="580137692">
-    <w:abstractNumId w:val="3"/>
+    <w:abstractNumId w:val="4"/>
   </w:num>
   <w:num w:numId="6" w16cid:durableId="528177687">
-    <w:abstractNumId w:val="6"/>
+    <w:abstractNumId w:val="11"/>
   </w:num>
   <w:num w:numId="7" w16cid:durableId="723411298">
     <w:abstractNumId w:val="0"/>
   </w:num>
   <w:num w:numId="8" w16cid:durableId="1546715531">
-    <w:abstractNumId w:val="2"/>
+    <w:abstractNumId w:val="3"/>
+  </w:num>
+  <w:num w:numId="9" w16cid:durableId="1511069461">
+    <w:abstractNumId w:val="8"/>
+  </w:num>
+  <w:num w:numId="10" w16cid:durableId="117073308">
+    <w:abstractNumId w:val="6"/>
+  </w:num>
+  <w:num w:numId="11" w16cid:durableId="1098408958">
+    <w:abstractNumId w:val="10"/>
+  </w:num>
+  <w:num w:numId="12" w16cid:durableId="46299004">
+    <w:abstractNumId w:val="5"/>
+  </w:num>
+  <w:num w:numId="13" w16cid:durableId="155456859">
+    <w:abstractNumId w:val="1"/>
   </w:num>
 </w:numbering>
 </file>

</xml_diff>